<commit_message>
# Definindo a Configuração baseURL
alterando a origem da URL
</commit_message>
<xml_diff>
--- a/Módulo_6_Testando e Automatizando Testes em Aplicações Web/Módulo 6 - Testando e Automatizando Testes em Aplicações Web.docx
+++ b/Módulo_6_Testando e Automatizando Testes em Aplicações Web/Módulo 6 - Testando e Automatizando Testes em Aplicações Web.docx
@@ -20523,7 +20523,7 @@
         <w:pStyle w:val="PargrafodaLista"/>
         <w:numPr>
           <w:ilvl w:val="0"/>
-          <w:numId w:val="47"/>
+          <w:numId w:val="46"/>
         </w:numPr>
         <w:spacing w:after="0"/>
       </w:pPr>
@@ -20560,7 +20560,7 @@
         <w:pStyle w:val="PargrafodaLista"/>
         <w:numPr>
           <w:ilvl w:val="0"/>
-          <w:numId w:val="47"/>
+          <w:numId w:val="46"/>
         </w:numPr>
         <w:spacing w:after="0"/>
       </w:pPr>
@@ -21128,7 +21128,7 @@
       <w:pPr>
         <w:numPr>
           <w:ilvl w:val="0"/>
-          <w:numId w:val="46"/>
+          <w:numId w:val="45"/>
         </w:numPr>
         <w:spacing w:after="0"/>
       </w:pPr>
@@ -21156,7 +21156,7 @@
       <w:pPr>
         <w:numPr>
           <w:ilvl w:val="0"/>
-          <w:numId w:val="46"/>
+          <w:numId w:val="45"/>
         </w:numPr>
         <w:spacing w:after="0"/>
       </w:pPr>
@@ -21184,7 +21184,7 @@
       <w:pPr>
         <w:numPr>
           <w:ilvl w:val="0"/>
-          <w:numId w:val="46"/>
+          <w:numId w:val="45"/>
         </w:numPr>
         <w:spacing w:after="0"/>
       </w:pPr>
@@ -22303,7 +22303,7 @@
       <w:pPr>
         <w:numPr>
           <w:ilvl w:val="0"/>
-          <w:numId w:val="48"/>
+          <w:numId w:val="47"/>
         </w:numPr>
         <w:spacing w:after="0"/>
       </w:pPr>
@@ -22335,7 +22335,7 @@
       <w:pPr>
         <w:numPr>
           <w:ilvl w:val="0"/>
-          <w:numId w:val="48"/>
+          <w:numId w:val="47"/>
         </w:numPr>
         <w:spacing w:after="0"/>
       </w:pPr>
@@ -22365,7 +22365,7 @@
       <w:pPr>
         <w:numPr>
           <w:ilvl w:val="0"/>
-          <w:numId w:val="48"/>
+          <w:numId w:val="47"/>
         </w:numPr>
         <w:spacing w:after="0"/>
       </w:pPr>
@@ -22387,7 +22387,7 @@
       <w:pPr>
         <w:numPr>
           <w:ilvl w:val="0"/>
-          <w:numId w:val="48"/>
+          <w:numId w:val="47"/>
         </w:numPr>
         <w:spacing w:after="0"/>
       </w:pPr>
@@ -23423,7 +23423,7 @@
       <w:pPr>
         <w:numPr>
           <w:ilvl w:val="0"/>
-          <w:numId w:val="49"/>
+          <w:numId w:val="48"/>
         </w:numPr>
         <w:spacing w:after="0"/>
       </w:pPr>
@@ -23442,6 +23442,217 @@
       <w:proofErr w:type="spellEnd"/>
       <w:r>
         <w:t>: executa os testes no ambiente local, utilizando http://localhost:4000.</w:t>
+      </w:r>
+    </w:p>
+    <w:p>
+      <w:pPr>
+        <w:numPr>
+          <w:ilvl w:val="0"/>
+          <w:numId w:val="48"/>
+        </w:numPr>
+        <w:spacing w:after="0"/>
+      </w:pPr>
+      <w:proofErr w:type="spellStart"/>
+      <w:r>
+        <w:t>npm</w:t>
+      </w:r>
+      <w:proofErr w:type="spellEnd"/>
+      <w:r>
+        <w:t xml:space="preserve"> </w:t>
+      </w:r>
+      <w:proofErr w:type="spellStart"/>
+      <w:r>
+        <w:t>run</w:t>
+      </w:r>
+      <w:proofErr w:type="spellEnd"/>
+      <w:r>
+        <w:t xml:space="preserve"> </w:t>
+      </w:r>
+      <w:proofErr w:type="spellStart"/>
+      <w:r>
+        <w:t>test-qa</w:t>
+      </w:r>
+      <w:proofErr w:type="spellEnd"/>
+      <w:r>
+        <w:t>: executa os testes no ambiente de QA.</w:t>
+      </w:r>
+    </w:p>
+    <w:p>
+      <w:pPr>
+        <w:numPr>
+          <w:ilvl w:val="0"/>
+          <w:numId w:val="48"/>
+        </w:numPr>
+        <w:spacing w:after="0"/>
+      </w:pPr>
+      <w:proofErr w:type="spellStart"/>
+      <w:r>
+        <w:t>npm</w:t>
+      </w:r>
+      <w:proofErr w:type="spellEnd"/>
+      <w:r>
+        <w:t xml:space="preserve"> </w:t>
+      </w:r>
+      <w:proofErr w:type="spellStart"/>
+      <w:r>
+        <w:t>run</w:t>
+      </w:r>
+      <w:proofErr w:type="spellEnd"/>
+      <w:r>
+        <w:t xml:space="preserve"> </w:t>
+      </w:r>
+      <w:proofErr w:type="spellStart"/>
+      <w:r>
+        <w:t>test-prod</w:t>
+      </w:r>
+      <w:proofErr w:type="spellEnd"/>
+      <w:r>
+        <w:t>: executa os testes no ambiente de produção.</w:t>
+      </w:r>
+    </w:p>
+    <w:p>
+      <w:pPr>
+        <w:spacing w:after="0"/>
+      </w:pPr>
+    </w:p>
+    <w:p>
+      <w:pPr>
+        <w:spacing w:after="0"/>
+      </w:pPr>
+      <w:r>
+        <w:t>Quando o comando é executado, o Cypress utiliza o valor atribuído à variável URL para acessar a aplicação.</w:t>
+      </w:r>
+    </w:p>
+    <w:p>
+      <w:pPr>
+        <w:spacing w:after="0"/>
+      </w:pPr>
+    </w:p>
+    <w:p>
+      <w:pPr>
+        <w:spacing w:after="0"/>
+      </w:pPr>
+      <w:r>
+        <w:t>Se o ambiente estiver disponível e apresentar as condições esperadas pelo teste, a execução poderá ser concluída com sucesso. Caso contrário, o teste poderá falhar.</w:t>
+      </w:r>
+    </w:p>
+    <w:p>
+      <w:pPr>
+        <w:spacing w:after="0"/>
+        <w:rPr>
+          <w:b/>
+          <w:bCs/>
+        </w:rPr>
+      </w:pPr>
+    </w:p>
+    <w:p>
+      <w:pPr>
+        <w:spacing w:after="0"/>
+        <w:rPr>
+          <w:b/>
+          <w:bCs/>
+        </w:rPr>
+      </w:pPr>
+      <w:r>
+        <w:rPr>
+          <w:b/>
+          <w:bCs/>
+        </w:rPr>
+        <w:t xml:space="preserve">5. Verificando os resultados com </w:t>
+      </w:r>
+      <w:proofErr w:type="spellStart"/>
+      <w:r>
+        <w:rPr>
+          <w:b/>
+          <w:bCs/>
+        </w:rPr>
+        <w:t>screenshots</w:t>
+      </w:r>
+      <w:proofErr w:type="spellEnd"/>
+    </w:p>
+    <w:p>
+      <w:pPr>
+        <w:spacing w:after="0"/>
+      </w:pPr>
+    </w:p>
+    <w:p>
+      <w:pPr>
+        <w:spacing w:after="0"/>
+      </w:pPr>
+      <w:r>
+        <w:t xml:space="preserve">Os </w:t>
+      </w:r>
+      <w:proofErr w:type="spellStart"/>
+      <w:r>
+        <w:t>screenshots</w:t>
+      </w:r>
+      <w:proofErr w:type="spellEnd"/>
+      <w:r>
+        <w:t xml:space="preserve"> ajudam a visualizar a página acessada durante a execução dos testes.</w:t>
+      </w:r>
+    </w:p>
+    <w:p>
+      <w:pPr>
+        <w:spacing w:after="0"/>
+      </w:pPr>
+    </w:p>
+    <w:p>
+      <w:pPr>
+        <w:spacing w:after="0"/>
+      </w:pPr>
+      <w:r>
+        <w:t xml:space="preserve">Ao utilizar variáveis de ambiente, podemos verificar se o Cypress realmente abriu o endereço configurado. </w:t>
+      </w:r>
+    </w:p>
+    <w:p>
+      <w:pPr>
+        <w:spacing w:after="0"/>
+      </w:pPr>
+    </w:p>
+    <w:p>
+      <w:pPr>
+        <w:spacing w:after="0"/>
+      </w:pPr>
+      <w:r>
+        <w:t xml:space="preserve">Por exemplo, ao executar um teste contra outro ambiente, o </w:t>
+      </w:r>
+      <w:proofErr w:type="spellStart"/>
+      <w:r>
+        <w:t>screenshot</w:t>
+      </w:r>
+      <w:proofErr w:type="spellEnd"/>
+      <w:r>
+        <w:t xml:space="preserve"> pode mostrar a página correspondente a esse endereço.</w:t>
+      </w:r>
+    </w:p>
+    <w:p>
+      <w:pPr>
+        <w:spacing w:after="0"/>
+      </w:pPr>
+    </w:p>
+    <w:p>
+      <w:pPr>
+        <w:spacing w:after="0"/>
+      </w:pPr>
+      <w:r>
+        <w:t>As capturas também auxiliam na investigação de falhas e na identificação de problemas durante a execução.</w:t>
+      </w:r>
+    </w:p>
+    <w:p>
+      <w:pPr>
+        <w:spacing w:after="0"/>
+        <w:rPr>
+          <w:b/>
+          <w:bCs/>
+        </w:rPr>
+      </w:pPr>
+      <w:r>
+        <w:rPr>
+          <w:b/>
+          <w:bCs/>
+        </w:rPr>
+        <w:lastRenderedPageBreak/>
+        <w:t>6. Vantagens das variáveis de ambiente</w:t>
       </w:r>
     </w:p>
     <w:p>
@@ -23452,29 +23663,8 @@
         </w:numPr>
         <w:spacing w:after="0"/>
       </w:pPr>
-      <w:proofErr w:type="spellStart"/>
-      <w:r>
-        <w:t>npm</w:t>
-      </w:r>
-      <w:proofErr w:type="spellEnd"/>
-      <w:r>
-        <w:t xml:space="preserve"> </w:t>
-      </w:r>
-      <w:proofErr w:type="spellStart"/>
-      <w:r>
-        <w:t>run</w:t>
-      </w:r>
-      <w:proofErr w:type="spellEnd"/>
-      <w:r>
-        <w:t xml:space="preserve"> </w:t>
-      </w:r>
-      <w:proofErr w:type="spellStart"/>
-      <w:r>
-        <w:t>test-qa</w:t>
-      </w:r>
-      <w:proofErr w:type="spellEnd"/>
-      <w:r>
-        <w:t>: executa os testes no ambiente de QA.</w:t>
+      <w:r>
+        <w:t>Permitem executar os mesmos testes em diferentes ambientes.</w:t>
       </w:r>
     </w:p>
     <w:p>
@@ -23485,174 +23675,282 @@
         </w:numPr>
         <w:spacing w:after="0"/>
       </w:pPr>
-      <w:proofErr w:type="spellStart"/>
-      <w:r>
-        <w:t>npm</w:t>
-      </w:r>
-      <w:proofErr w:type="spellEnd"/>
-      <w:r>
-        <w:t xml:space="preserve"> </w:t>
-      </w:r>
-      <w:proofErr w:type="spellStart"/>
-      <w:r>
-        <w:t>run</w:t>
-      </w:r>
-      <w:proofErr w:type="spellEnd"/>
-      <w:r>
-        <w:t xml:space="preserve"> </w:t>
-      </w:r>
-      <w:proofErr w:type="spellStart"/>
-      <w:r>
-        <w:t>test-prod</w:t>
-      </w:r>
-      <w:proofErr w:type="spellEnd"/>
-      <w:r>
-        <w:t>: executa os testes no ambiente de produção.</w:t>
-      </w:r>
-    </w:p>
-    <w:p>
-      <w:pPr>
-        <w:spacing w:after="0"/>
-      </w:pPr>
-    </w:p>
-    <w:p>
-      <w:pPr>
-        <w:spacing w:after="0"/>
-      </w:pPr>
-      <w:r>
-        <w:t>Quando o comando é executado, o Cypress utiliza o valor atribuído à variável URL para acessar a aplicação.</w:t>
-      </w:r>
-    </w:p>
-    <w:p>
-      <w:pPr>
-        <w:spacing w:after="0"/>
-      </w:pPr>
-    </w:p>
-    <w:p>
-      <w:pPr>
-        <w:spacing w:after="0"/>
-      </w:pPr>
-      <w:r>
-        <w:t>Se o ambiente estiver disponível e apresentar as condições esperadas pelo teste, a execução poderá ser concluída com sucesso. Caso contrário, o teste poderá falhar.</w:t>
-      </w:r>
-    </w:p>
-    <w:p>
-      <w:pPr>
-        <w:spacing w:after="0"/>
-        <w:rPr>
-          <w:b/>
-          <w:bCs/>
-        </w:rPr>
-      </w:pPr>
-    </w:p>
-    <w:p>
-      <w:pPr>
-        <w:spacing w:after="0"/>
-        <w:rPr>
-          <w:b/>
-          <w:bCs/>
-        </w:rPr>
-      </w:pPr>
-      <w:r>
-        <w:rPr>
-          <w:b/>
-          <w:bCs/>
-        </w:rPr>
-        <w:t xml:space="preserve">5. Verificando os resultados com </w:t>
-      </w:r>
-      <w:proofErr w:type="spellStart"/>
-      <w:r>
-        <w:rPr>
-          <w:b/>
-          <w:bCs/>
-        </w:rPr>
-        <w:t>screenshots</w:t>
-      </w:r>
-      <w:proofErr w:type="spellEnd"/>
-    </w:p>
-    <w:p>
-      <w:pPr>
-        <w:spacing w:after="0"/>
-      </w:pPr>
-    </w:p>
-    <w:p>
-      <w:pPr>
-        <w:spacing w:after="0"/>
-      </w:pPr>
-      <w:r>
-        <w:t xml:space="preserve">Os </w:t>
-      </w:r>
-      <w:proofErr w:type="spellStart"/>
-      <w:r>
-        <w:t>screenshots</w:t>
-      </w:r>
-      <w:proofErr w:type="spellEnd"/>
-      <w:r>
-        <w:t xml:space="preserve"> ajudam a visualizar a página acessada durante a execução dos testes.</w:t>
-      </w:r>
-    </w:p>
-    <w:p>
-      <w:pPr>
-        <w:spacing w:after="0"/>
-      </w:pPr>
-    </w:p>
-    <w:p>
-      <w:pPr>
-        <w:spacing w:after="0"/>
-      </w:pPr>
-      <w:r>
-        <w:t xml:space="preserve">Ao utilizar variáveis de ambiente, podemos verificar se o Cypress realmente abriu o endereço configurado. </w:t>
-      </w:r>
-    </w:p>
-    <w:p>
-      <w:pPr>
-        <w:spacing w:after="0"/>
-      </w:pPr>
-    </w:p>
-    <w:p>
-      <w:pPr>
-        <w:spacing w:after="0"/>
-      </w:pPr>
-      <w:r>
-        <w:t xml:space="preserve">Por exemplo, ao executar um teste contra outro ambiente, o </w:t>
-      </w:r>
-      <w:proofErr w:type="spellStart"/>
-      <w:r>
-        <w:t>screenshot</w:t>
-      </w:r>
-      <w:proofErr w:type="spellEnd"/>
-      <w:r>
-        <w:t xml:space="preserve"> pode mostrar a página correspondente a esse endereço.</w:t>
-      </w:r>
-    </w:p>
-    <w:p>
-      <w:pPr>
-        <w:spacing w:after="0"/>
-      </w:pPr>
-    </w:p>
-    <w:p>
-      <w:pPr>
-        <w:spacing w:after="0"/>
-      </w:pPr>
-      <w:r>
-        <w:t>As capturas também auxiliam na investigação de falhas e na identificação de problemas durante a execução.</w:t>
-      </w:r>
-    </w:p>
-    <w:p>
-      <w:pPr>
-        <w:spacing w:after="0"/>
-        <w:rPr>
-          <w:b/>
-          <w:bCs/>
-        </w:rPr>
-      </w:pPr>
-      <w:r>
-        <w:rPr>
-          <w:b/>
-          <w:bCs/>
-        </w:rPr>
-        <w:lastRenderedPageBreak/>
-        <w:t>6. Vantagens das variáveis de ambiente</w:t>
+      <w:r>
+        <w:t>Evitam alterar o código dos testes para trocar endereços.</w:t>
+      </w:r>
+    </w:p>
+    <w:p>
+      <w:pPr>
+        <w:numPr>
+          <w:ilvl w:val="0"/>
+          <w:numId w:val="49"/>
+        </w:numPr>
+        <w:spacing w:after="0"/>
+      </w:pPr>
+      <w:r>
+        <w:t>Facilitam a manutenção dos scripts.</w:t>
+      </w:r>
+    </w:p>
+    <w:p>
+      <w:pPr>
+        <w:numPr>
+          <w:ilvl w:val="0"/>
+          <w:numId w:val="49"/>
+        </w:numPr>
+        <w:spacing w:after="0"/>
+      </w:pPr>
+      <w:r>
+        <w:t>Reduzem alterações desnecessárias no controle de versão.</w:t>
+      </w:r>
+    </w:p>
+    <w:p>
+      <w:pPr>
+        <w:numPr>
+          <w:ilvl w:val="0"/>
+          <w:numId w:val="49"/>
+        </w:numPr>
+        <w:spacing w:after="0"/>
+      </w:pPr>
+      <w:r>
+        <w:t>Permitem configurar diferentes valores para cada execução.</w:t>
+      </w:r>
+    </w:p>
+    <w:p>
+      <w:pPr>
+        <w:spacing w:after="0"/>
+        <w:rPr>
+          <w:b/>
+          <w:bCs/>
+        </w:rPr>
+      </w:pPr>
+    </w:p>
+    <w:p>
+      <w:pPr>
+        <w:spacing w:after="0"/>
+      </w:pPr>
+      <w:r>
+        <w:rPr>
+          <w:b/>
+          <w:bCs/>
+        </w:rPr>
+        <w:t>Atenção:</w:t>
+      </w:r>
+      <w:r>
+        <w:t xml:space="preserve"> testes em produção devem ser realizados somente com autorização e com cuidado para não modificar dados reais.</w:t>
+      </w:r>
+    </w:p>
+    <w:p>
+      <w:pPr>
+        <w:spacing w:after="0"/>
+        <w:rPr>
+          <w:b/>
+          <w:bCs/>
+        </w:rPr>
+      </w:pPr>
+    </w:p>
+    <w:p>
+      <w:pPr>
+        <w:spacing w:after="0"/>
+        <w:rPr>
+          <w:b/>
+          <w:bCs/>
+        </w:rPr>
+      </w:pPr>
+      <w:r>
+        <w:rPr>
+          <w:b/>
+          <w:bCs/>
+        </w:rPr>
+        <w:t>Conclusão</w:t>
+      </w:r>
+    </w:p>
+    <w:p>
+      <w:pPr>
+        <w:spacing w:after="0"/>
+        <w:rPr>
+          <w:u w:val="single"/>
+        </w:rPr>
+      </w:pPr>
+      <w:r>
+        <w:t xml:space="preserve">As variáveis de ambiente tornam os testes automatizados mais flexíveis e reutilizáveis. No Cypress, podemos definir os valores no </w:t>
+      </w:r>
+      <w:proofErr w:type="spellStart"/>
+      <w:proofErr w:type="gramStart"/>
+      <w:r>
+        <w:t>package.json</w:t>
+      </w:r>
+      <w:proofErr w:type="spellEnd"/>
+      <w:proofErr w:type="gramEnd"/>
+      <w:r>
+        <w:t xml:space="preserve"> utilizando --</w:t>
+      </w:r>
+      <w:proofErr w:type="spellStart"/>
+      <w:r>
+        <w:t>env</w:t>
+      </w:r>
+      <w:proofErr w:type="spellEnd"/>
+      <w:r>
+        <w:t xml:space="preserve"> e recuperá-los no script por meio de </w:t>
+      </w:r>
+      <w:proofErr w:type="spellStart"/>
+      <w:proofErr w:type="gramStart"/>
+      <w:r>
+        <w:t>Cypress.env</w:t>
+      </w:r>
+      <w:proofErr w:type="spellEnd"/>
+      <w:r>
+        <w:t>(</w:t>
+      </w:r>
+      <w:proofErr w:type="gramEnd"/>
+      <w:r>
+        <w:t>).</w:t>
+      </w:r>
+    </w:p>
+    <w:p>
+      <w:pPr>
+        <w:spacing w:after="0"/>
+      </w:pPr>
+    </w:p>
+    <w:p>
+      <w:pPr>
+        <w:spacing w:after="0"/>
+      </w:pPr>
+      <w:r>
+        <w:t>Assim, o mesmo teste de login pode ser executado em diferentes ambientes sem precisar modificar seu código.</w:t>
+      </w:r>
+    </w:p>
+    <w:p>
+      <w:pPr>
+        <w:spacing w:after="0"/>
+        <w:rPr>
+          <w:b/>
+          <w:bCs/>
+        </w:rPr>
+      </w:pPr>
+      <w:r>
+        <w:pict w14:anchorId="7C677732">
+          <v:rect id="_x0000_i1073" style="width:0;height:1.5pt" o:bullet="t" o:hrstd="t" o:hr="t" fillcolor="#a0a0a0" stroked="f"/>
+        </w:pict>
+      </w:r>
+    </w:p>
+    <w:p>
+      <w:pPr>
+        <w:spacing w:after="0"/>
+        <w:rPr>
+          <w:b/>
+          <w:bCs/>
+        </w:rPr>
+      </w:pPr>
+      <w:r>
+        <w:rPr>
+          <w:b/>
+          <w:bCs/>
+        </w:rPr>
+        <w:t>1</w:t>
+      </w:r>
+      <w:r>
+        <w:rPr>
+          <w:b/>
+          <w:bCs/>
+        </w:rPr>
+        <w:t>9</w:t>
+      </w:r>
+      <w:r>
+        <w:rPr>
+          <w:b/>
+          <w:bCs/>
+        </w:rPr>
+        <w:t xml:space="preserve">. </w:t>
+      </w:r>
+      <w:r>
+        <w:rPr>
+          <w:b/>
+          <w:bCs/>
+        </w:rPr>
+        <w:t>DEFININDO A CONFIGURAÇÃO BASEURL</w:t>
+      </w:r>
+    </w:p>
+    <w:p>
+      <w:pPr>
+        <w:spacing w:after="0"/>
+        <w:rPr>
+          <w:b/>
+          <w:bCs/>
+        </w:rPr>
+      </w:pPr>
+    </w:p>
+    <w:p>
+      <w:pPr>
+        <w:spacing w:after="0"/>
+        <w:rPr>
+          <w:b/>
+          <w:bCs/>
+        </w:rPr>
+      </w:pPr>
+      <w:r>
+        <w:rPr>
+          <w:b/>
+          <w:bCs/>
+        </w:rPr>
+        <w:t xml:space="preserve">1. O que é </w:t>
+      </w:r>
+      <w:proofErr w:type="spellStart"/>
+      <w:r>
+        <w:rPr>
+          <w:b/>
+          <w:bCs/>
+        </w:rPr>
+        <w:t>baseUrl</w:t>
+      </w:r>
+      <w:proofErr w:type="spellEnd"/>
+      <w:r>
+        <w:rPr>
+          <w:b/>
+          <w:bCs/>
+        </w:rPr>
+        <w:t>?</w:t>
+      </w:r>
+    </w:p>
+    <w:p>
+      <w:pPr>
+        <w:spacing w:after="0"/>
+      </w:pPr>
+      <w:r>
+        <w:t xml:space="preserve">O </w:t>
+      </w:r>
+      <w:proofErr w:type="spellStart"/>
+      <w:r>
+        <w:t>baseUrl</w:t>
+      </w:r>
+      <w:proofErr w:type="spellEnd"/>
+      <w:r>
+        <w:t xml:space="preserve"> define o endereço-base da aplicação que será testada. Ele evita repetir a URL completa em cada teste.</w:t>
+      </w:r>
+    </w:p>
+    <w:p>
+      <w:pPr>
+        <w:spacing w:after="0"/>
+      </w:pPr>
+    </w:p>
+    <w:p>
+      <w:pPr>
+        <w:spacing w:after="0"/>
+      </w:pPr>
+      <w:r>
+        <w:t>Exemplo de endereço-base: http://localhost:4000</w:t>
+      </w:r>
+    </w:p>
+    <w:p>
+      <w:pPr>
+        <w:spacing w:after="0"/>
+      </w:pPr>
+    </w:p>
+    <w:p>
+      <w:pPr>
+        <w:spacing w:after="0"/>
+      </w:pPr>
+      <w:r>
+        <w:t>Páginas da aplicação:</w:t>
       </w:r>
     </w:p>
     <w:p>
@@ -23664,7 +23962,7 @@
         <w:spacing w:after="0"/>
       </w:pPr>
       <w:r>
-        <w:t>Permitem executar os mesmos testes em diferentes ambientes.</w:t>
+        <w:t>http://localhost:4000/login</w:t>
       </w:r>
     </w:p>
     <w:p>
@@ -23676,7 +23974,7 @@
         <w:spacing w:after="0"/>
       </w:pPr>
       <w:r>
-        <w:t>Evitam alterar o código dos testes para trocar endereços.</w:t>
+        <w:t>http://localhost:4000/usuarios</w:t>
       </w:r>
     </w:p>
     <w:p>
@@ -23688,175 +23986,606 @@
         <w:spacing w:after="0"/>
       </w:pPr>
       <w:r>
-        <w:t>Facilitam a manutenção dos scripts.</w:t>
+        <w:t>http://localhost:4000/transferencias</w:t>
+      </w:r>
+    </w:p>
+    <w:p>
+      <w:pPr>
+        <w:spacing w:after="0"/>
+        <w:rPr>
+          <w:b/>
+          <w:bCs/>
+        </w:rPr>
+      </w:pPr>
+    </w:p>
+    <w:p>
+      <w:pPr>
+        <w:spacing w:after="0"/>
+        <w:rPr>
+          <w:b/>
+          <w:bCs/>
+        </w:rPr>
+      </w:pPr>
+      <w:r>
+        <w:rPr>
+          <w:b/>
+          <w:bCs/>
+        </w:rPr>
+        <w:t>2. Como configurar</w:t>
+      </w:r>
+    </w:p>
+    <w:p>
+      <w:pPr>
+        <w:spacing w:after="0"/>
+      </w:pPr>
+      <w:r>
+        <w:t xml:space="preserve">No arquivo cypress.config.js, adicione </w:t>
+      </w:r>
+      <w:proofErr w:type="spellStart"/>
+      <w:r>
+        <w:t>baseUrl</w:t>
+      </w:r>
+      <w:proofErr w:type="spellEnd"/>
+      <w:r>
+        <w:t xml:space="preserve"> dentro de e2e:</w:t>
+      </w:r>
+    </w:p>
+    <w:p>
+      <w:pPr>
+        <w:spacing w:after="0"/>
+      </w:pPr>
+    </w:p>
+    <w:p>
+      <w:pPr>
+        <w:spacing w:after="0"/>
+      </w:pPr>
+      <w:proofErr w:type="spellStart"/>
+      <w:r>
+        <w:t>const</w:t>
+      </w:r>
+      <w:proofErr w:type="spellEnd"/>
+      <w:r>
+        <w:t xml:space="preserve"> </w:t>
+      </w:r>
+      <w:proofErr w:type="gramStart"/>
+      <w:r>
+        <w:t xml:space="preserve">{ </w:t>
+      </w:r>
+      <w:proofErr w:type="spellStart"/>
+      <w:r>
+        <w:t>defineConfig</w:t>
+      </w:r>
+      <w:proofErr w:type="spellEnd"/>
+      <w:proofErr w:type="gramEnd"/>
+      <w:r>
+        <w:t xml:space="preserve"> } = require('</w:t>
+      </w:r>
+      <w:proofErr w:type="spellStart"/>
+      <w:r>
+        <w:t>cypress</w:t>
+      </w:r>
+      <w:proofErr w:type="spellEnd"/>
+      <w:r>
+        <w:t>');</w:t>
+      </w:r>
+    </w:p>
+    <w:p>
+      <w:pPr>
+        <w:spacing w:after="0"/>
+      </w:pPr>
+    </w:p>
+    <w:p>
+      <w:pPr>
+        <w:spacing w:after="0"/>
+      </w:pPr>
+      <w:proofErr w:type="spellStart"/>
+      <w:proofErr w:type="gramStart"/>
+      <w:r>
+        <w:t>module.exports</w:t>
+      </w:r>
+      <w:proofErr w:type="spellEnd"/>
+      <w:proofErr w:type="gramEnd"/>
+      <w:r>
+        <w:t xml:space="preserve"> = </w:t>
+      </w:r>
+      <w:proofErr w:type="spellStart"/>
+      <w:proofErr w:type="gramStart"/>
+      <w:r>
+        <w:t>defineConfig</w:t>
+      </w:r>
+      <w:proofErr w:type="spellEnd"/>
+      <w:r>
+        <w:t>(</w:t>
+      </w:r>
+      <w:proofErr w:type="gramEnd"/>
+      <w:r>
+        <w:t>{</w:t>
+      </w:r>
+    </w:p>
+    <w:p>
+      <w:pPr>
+        <w:spacing w:after="0"/>
+      </w:pPr>
+      <w:r>
+        <w:t xml:space="preserve">  e2e: {</w:t>
+      </w:r>
+    </w:p>
+    <w:p>
+      <w:pPr>
+        <w:spacing w:after="0"/>
+      </w:pPr>
+      <w:r>
+        <w:t xml:space="preserve">    </w:t>
+      </w:r>
+      <w:proofErr w:type="spellStart"/>
+      <w:r>
+        <w:t>baseUrl</w:t>
+      </w:r>
+      <w:proofErr w:type="spellEnd"/>
+      <w:r>
+        <w:t>: 'http://localhost:4000',</w:t>
+      </w:r>
+    </w:p>
+    <w:p>
+      <w:pPr>
+        <w:spacing w:after="0"/>
+      </w:pPr>
+      <w:r>
+        <w:t xml:space="preserve">  },</w:t>
+      </w:r>
+    </w:p>
+    <w:p>
+      <w:pPr>
+        <w:spacing w:after="0"/>
+      </w:pPr>
+      <w:r>
+        <w:t>});</w:t>
+      </w:r>
+    </w:p>
+    <w:p>
+      <w:pPr>
+        <w:spacing w:after="0"/>
+      </w:pPr>
+    </w:p>
+    <w:p>
+      <w:pPr>
+        <w:spacing w:after="0"/>
+      </w:pPr>
+      <w:r>
+        <w:t xml:space="preserve">Se o arquivo já tiver outras configurações, mantenha-as e adicione apenas a propriedade </w:t>
+      </w:r>
+      <w:proofErr w:type="spellStart"/>
+      <w:r>
+        <w:t>baseUrl</w:t>
+      </w:r>
+      <w:proofErr w:type="spellEnd"/>
+      <w:r>
+        <w:t xml:space="preserve"> dentro de e2e.</w:t>
+      </w:r>
+    </w:p>
+    <w:p>
+      <w:pPr>
+        <w:spacing w:after="0"/>
+      </w:pPr>
+    </w:p>
+    <w:p>
+      <w:pPr>
+        <w:spacing w:after="0"/>
+        <w:rPr>
+          <w:b/>
+          <w:bCs/>
+        </w:rPr>
+      </w:pPr>
+      <w:r>
+        <w:rPr>
+          <w:b/>
+          <w:bCs/>
+        </w:rPr>
+        <w:lastRenderedPageBreak/>
+        <w:t>3. Como usar nos testes</w:t>
+      </w:r>
+    </w:p>
+    <w:p>
+      <w:pPr>
+        <w:spacing w:after="0"/>
+      </w:pPr>
+      <w:r>
+        <w:t xml:space="preserve">Sem </w:t>
+      </w:r>
+      <w:proofErr w:type="spellStart"/>
+      <w:r>
+        <w:t>baseUrl</w:t>
+      </w:r>
+      <w:proofErr w:type="spellEnd"/>
+      <w:r>
+        <w:t>, é necessário informar o endereço completo:</w:t>
+      </w:r>
+    </w:p>
+    <w:p>
+      <w:pPr>
+        <w:spacing w:after="0"/>
+        <w:rPr>
+          <w:b/>
+          <w:bCs/>
+        </w:rPr>
+      </w:pPr>
+      <w:proofErr w:type="spellStart"/>
+      <w:proofErr w:type="gramStart"/>
+      <w:r>
+        <w:rPr>
+          <w:b/>
+          <w:bCs/>
+        </w:rPr>
+        <w:t>cy.visit</w:t>
+      </w:r>
+      <w:proofErr w:type="spellEnd"/>
+      <w:proofErr w:type="gramEnd"/>
+      <w:r>
+        <w:rPr>
+          <w:b/>
+          <w:bCs/>
+        </w:rPr>
+        <w:t>('http://localhost:4000/login');</w:t>
+      </w:r>
+    </w:p>
+    <w:p>
+      <w:pPr>
+        <w:spacing w:after="0"/>
+      </w:pPr>
+    </w:p>
+    <w:p>
+      <w:pPr>
+        <w:spacing w:after="0"/>
+      </w:pPr>
+      <w:r>
+        <w:t xml:space="preserve">Com </w:t>
+      </w:r>
+      <w:proofErr w:type="spellStart"/>
+      <w:r>
+        <w:t>baseUrl</w:t>
+      </w:r>
+      <w:proofErr w:type="spellEnd"/>
+      <w:r>
+        <w:t>, basta informar o caminho:</w:t>
+      </w:r>
+    </w:p>
+    <w:p>
+      <w:pPr>
+        <w:spacing w:after="0"/>
+        <w:rPr>
+          <w:b/>
+          <w:bCs/>
+        </w:rPr>
+      </w:pPr>
+      <w:proofErr w:type="spellStart"/>
+      <w:proofErr w:type="gramStart"/>
+      <w:r>
+        <w:rPr>
+          <w:b/>
+          <w:bCs/>
+        </w:rPr>
+        <w:t>cy.visit</w:t>
+      </w:r>
+      <w:proofErr w:type="spellEnd"/>
+      <w:proofErr w:type="gramEnd"/>
+      <w:r>
+        <w:rPr>
+          <w:b/>
+          <w:bCs/>
+        </w:rPr>
+        <w:t>('/login');</w:t>
+      </w:r>
+    </w:p>
+    <w:p>
+      <w:pPr>
+        <w:spacing w:after="0"/>
+      </w:pPr>
+    </w:p>
+    <w:p>
+      <w:pPr>
+        <w:spacing w:after="0"/>
+      </w:pPr>
+      <w:r>
+        <w:t>O Cypress acessará http://localhost:4000/login.</w:t>
+      </w:r>
+    </w:p>
+    <w:p>
+      <w:pPr>
+        <w:spacing w:after="0"/>
+      </w:pPr>
+      <w:r>
+        <w:t>A mesma configuração pode ser usada em requisições HTTP:</w:t>
+      </w:r>
+    </w:p>
+    <w:p>
+      <w:pPr>
+        <w:spacing w:after="0"/>
+        <w:rPr>
+          <w:b/>
+          <w:bCs/>
+        </w:rPr>
+      </w:pPr>
+      <w:proofErr w:type="spellStart"/>
+      <w:proofErr w:type="gramStart"/>
+      <w:r>
+        <w:rPr>
+          <w:b/>
+          <w:bCs/>
+        </w:rPr>
+        <w:t>cy.request</w:t>
+      </w:r>
+      <w:proofErr w:type="spellEnd"/>
+      <w:proofErr w:type="gramEnd"/>
+      <w:r>
+        <w:rPr>
+          <w:b/>
+          <w:bCs/>
+        </w:rPr>
+        <w:t>('/</w:t>
+      </w:r>
+      <w:proofErr w:type="spellStart"/>
+      <w:r>
+        <w:rPr>
+          <w:b/>
+          <w:bCs/>
+        </w:rPr>
+        <w:t>usuarios</w:t>
+      </w:r>
+      <w:proofErr w:type="spellEnd"/>
+      <w:r>
+        <w:rPr>
+          <w:b/>
+          <w:bCs/>
+        </w:rPr>
+        <w:t>');</w:t>
+      </w:r>
+    </w:p>
+    <w:p>
+      <w:pPr>
+        <w:spacing w:after="0"/>
+      </w:pPr>
+    </w:p>
+    <w:p>
+      <w:pPr>
+        <w:spacing w:after="0"/>
+      </w:pPr>
+      <w:r>
+        <w:t xml:space="preserve">O </w:t>
+      </w:r>
+      <w:proofErr w:type="spellStart"/>
+      <w:r>
+        <w:t>endpoint</w:t>
+      </w:r>
+      <w:proofErr w:type="spellEnd"/>
+      <w:r>
+        <w:t xml:space="preserve"> /</w:t>
+      </w:r>
+      <w:proofErr w:type="spellStart"/>
+      <w:r>
+        <w:t>usuarios</w:t>
+      </w:r>
+      <w:proofErr w:type="spellEnd"/>
+      <w:r>
+        <w:t xml:space="preserve"> precisa existir na aplicação ou API testada.</w:t>
+      </w:r>
+    </w:p>
+    <w:p>
+      <w:pPr>
+        <w:spacing w:after="0"/>
+        <w:rPr>
+          <w:b/>
+          <w:bCs/>
+        </w:rPr>
+      </w:pPr>
+    </w:p>
+    <w:p>
+      <w:pPr>
+        <w:spacing w:after="0"/>
+        <w:rPr>
+          <w:b/>
+          <w:bCs/>
+        </w:rPr>
+      </w:pPr>
+      <w:r>
+        <w:rPr>
+          <w:b/>
+          <w:bCs/>
+        </w:rPr>
+        <w:t xml:space="preserve">4. Diferença entre </w:t>
+      </w:r>
+      <w:proofErr w:type="spellStart"/>
+      <w:r>
+        <w:rPr>
+          <w:b/>
+          <w:bCs/>
+        </w:rPr>
+        <w:t>baseUrl</w:t>
+      </w:r>
+      <w:proofErr w:type="spellEnd"/>
+      <w:r>
+        <w:rPr>
+          <w:b/>
+          <w:bCs/>
+        </w:rPr>
+        <w:t xml:space="preserve"> e variáveis de ambiente</w:t>
       </w:r>
     </w:p>
     <w:p>
       <w:pPr>
         <w:numPr>
           <w:ilvl w:val="0"/>
-          <w:numId w:val="50"/>
+          <w:numId w:val="51"/>
         </w:numPr>
         <w:spacing w:after="0"/>
       </w:pPr>
-      <w:r>
-        <w:t>Reduzem alterações desnecessárias no controle de versão.</w:t>
+      <w:proofErr w:type="spellStart"/>
+      <w:r>
+        <w:rPr>
+          <w:b/>
+          <w:bCs/>
+        </w:rPr>
+        <w:t>baseUrl</w:t>
+      </w:r>
+      <w:proofErr w:type="spellEnd"/>
+      <w:r>
+        <w:rPr>
+          <w:b/>
+          <w:bCs/>
+        </w:rPr>
+        <w:t>:</w:t>
+      </w:r>
+      <w:r>
+        <w:t xml:space="preserve"> define o endereço-base da aplicação e é utilizado automaticamente por comandos como </w:t>
+      </w:r>
+      <w:proofErr w:type="spellStart"/>
+      <w:proofErr w:type="gramStart"/>
+      <w:r>
+        <w:t>cy.visit</w:t>
+      </w:r>
+      <w:proofErr w:type="spellEnd"/>
+      <w:proofErr w:type="gramEnd"/>
+      <w:r>
+        <w:t xml:space="preserve">() e </w:t>
+      </w:r>
+      <w:proofErr w:type="spellStart"/>
+      <w:proofErr w:type="gramStart"/>
+      <w:r>
+        <w:t>cy.request</w:t>
+      </w:r>
+      <w:proofErr w:type="spellEnd"/>
+      <w:proofErr w:type="gramEnd"/>
+      <w:r>
+        <w:t>() quando recebem caminhos relativos.</w:t>
       </w:r>
     </w:p>
     <w:p>
       <w:pPr>
         <w:numPr>
           <w:ilvl w:val="0"/>
-          <w:numId w:val="50"/>
+          <w:numId w:val="51"/>
         </w:numPr>
         <w:spacing w:after="0"/>
       </w:pPr>
       <w:r>
-        <w:t>Permitem configurar diferentes valores para cada execução.</w:t>
-      </w:r>
-    </w:p>
-    <w:p>
-      <w:pPr>
-        <w:spacing w:after="0"/>
-        <w:rPr>
-          <w:b/>
-          <w:bCs/>
-        </w:rPr>
-      </w:pPr>
-    </w:p>
-    <w:p>
-      <w:pPr>
-        <w:spacing w:after="0"/>
-      </w:pPr>
-      <w:r>
-        <w:rPr>
-          <w:b/>
-          <w:bCs/>
-        </w:rPr>
-        <w:t>Atenção:</w:t>
-      </w:r>
-      <w:r>
-        <w:t xml:space="preserve"> testes em produção devem ser realizados somente com autorização e com cuidado para não modificar dados reais.</w:t>
-      </w:r>
-    </w:p>
-    <w:p>
-      <w:pPr>
-        <w:spacing w:after="0"/>
-        <w:rPr>
-          <w:b/>
-          <w:bCs/>
-        </w:rPr>
-      </w:pPr>
-    </w:p>
-    <w:p>
-      <w:pPr>
-        <w:spacing w:after="0"/>
-        <w:rPr>
-          <w:b/>
-          <w:bCs/>
-        </w:rPr>
-      </w:pPr>
-      <w:r>
-        <w:rPr>
-          <w:b/>
-          <w:bCs/>
-        </w:rPr>
-        <w:t>Conclusão</w:t>
-      </w:r>
-    </w:p>
-    <w:p>
-      <w:pPr>
-        <w:spacing w:after="0"/>
-        <w:rPr>
-          <w:u w:val="single"/>
-        </w:rPr>
-      </w:pPr>
-      <w:r>
-        <w:t xml:space="preserve">As variáveis de ambiente tornam os testes automatizados mais flexíveis e reutilizáveis. No Cypress, podemos definir os valores no </w:t>
+        <w:rPr>
+          <w:b/>
+          <w:bCs/>
+        </w:rPr>
+        <w:t>Variáveis de ambiente:</w:t>
+      </w:r>
+      <w:r>
+        <w:t xml:space="preserve"> armazenam valores que podem variar conforme a execução, como tokens e parâmetros de teste.</w:t>
+      </w:r>
+    </w:p>
+    <w:p>
+      <w:pPr>
+        <w:spacing w:after="0"/>
+        <w:rPr>
+          <w:b/>
+          <w:bCs/>
+        </w:rPr>
+      </w:pPr>
+    </w:p>
+    <w:p>
+      <w:pPr>
+        <w:spacing w:after="0"/>
+        <w:rPr>
+          <w:b/>
+          <w:bCs/>
+        </w:rPr>
+      </w:pPr>
+      <w:r>
+        <w:rPr>
+          <w:b/>
+          <w:bCs/>
+        </w:rPr>
+        <w:t>5. Resumo para QA</w:t>
+      </w:r>
+    </w:p>
+    <w:p>
+      <w:pPr>
+        <w:numPr>
+          <w:ilvl w:val="0"/>
+          <w:numId w:val="52"/>
+        </w:numPr>
+        <w:spacing w:after="0"/>
+      </w:pPr>
+      <w:r>
+        <w:rPr>
+          <w:b/>
+          <w:bCs/>
+        </w:rPr>
+        <w:t>Quando usar:</w:t>
+      </w:r>
+      <w:r>
+        <w:t xml:space="preserve"> quando a parte inicial da URL se repete nos testes.</w:t>
+      </w:r>
+    </w:p>
+    <w:p>
+      <w:pPr>
+        <w:numPr>
+          <w:ilvl w:val="0"/>
+          <w:numId w:val="52"/>
+        </w:numPr>
+        <w:spacing w:after="0"/>
+      </w:pPr>
+      <w:r>
+        <w:rPr>
+          <w:b/>
+          <w:bCs/>
+        </w:rPr>
+        <w:t>Onde configurar:</w:t>
+      </w:r>
+      <w:r>
+        <w:t xml:space="preserve"> cypress.config.js, dentro de e2e.</w:t>
+      </w:r>
+    </w:p>
+    <w:p>
+      <w:pPr>
+        <w:numPr>
+          <w:ilvl w:val="0"/>
+          <w:numId w:val="52"/>
+        </w:numPr>
+        <w:spacing w:after="0"/>
+      </w:pPr>
+      <w:r>
+        <w:rPr>
+          <w:b/>
+          <w:bCs/>
+        </w:rPr>
+        <w:t>Benefício:</w:t>
+      </w:r>
+      <w:r>
+        <w:t xml:space="preserve"> reduz a repetição e facilita a manutenção dos testes.</w:t>
+      </w:r>
+    </w:p>
+    <w:p>
+      <w:pPr>
+        <w:numPr>
+          <w:ilvl w:val="0"/>
+          <w:numId w:val="52"/>
+        </w:numPr>
+        <w:spacing w:after="0"/>
+      </w:pPr>
+      <w:r>
+        <w:rPr>
+          <w:b/>
+          <w:bCs/>
+        </w:rPr>
+        <w:t>Exemplo:</w:t>
+      </w:r>
+      <w:r>
+        <w:t xml:space="preserve"> </w:t>
       </w:r>
       <w:proofErr w:type="spellStart"/>
       <w:proofErr w:type="gramStart"/>
       <w:r>
-        <w:t>package.json</w:t>
+        <w:t>cy.visit</w:t>
       </w:r>
       <w:proofErr w:type="spellEnd"/>
       <w:proofErr w:type="gramEnd"/>
       <w:r>
-        <w:t xml:space="preserve"> utilizando --</w:t>
-      </w:r>
-      <w:proofErr w:type="spellStart"/>
-      <w:r>
-        <w:t>env</w:t>
-      </w:r>
-      <w:proofErr w:type="spellEnd"/>
-      <w:r>
-        <w:t xml:space="preserve"> e recuperá-los no script por meio de </w:t>
-      </w:r>
-      <w:proofErr w:type="spellStart"/>
-      <w:proofErr w:type="gramStart"/>
-      <w:r>
-        <w:t>Cypress.env</w:t>
-      </w:r>
-      <w:proofErr w:type="spellEnd"/>
-      <w:r>
-        <w:t>(</w:t>
-      </w:r>
-      <w:proofErr w:type="gramEnd"/>
-      <w:r>
-        <w:t>).</w:t>
-      </w:r>
-    </w:p>
-    <w:p>
-      <w:pPr>
-        <w:spacing w:after="0"/>
-      </w:pPr>
-    </w:p>
-    <w:p>
-      <w:pPr>
-        <w:spacing w:after="0"/>
-      </w:pPr>
-      <w:r>
-        <w:t>Assim, o mesmo teste de login pode ser executado em diferentes ambientes sem precisar modificar seu código.</w:t>
-      </w:r>
-    </w:p>
-    <w:p>
-      <w:pPr>
-        <w:spacing w:after="0"/>
-        <w:rPr>
-          <w:b/>
-          <w:bCs/>
-        </w:rPr>
-      </w:pPr>
-      <w:r>
-        <w:pict w14:anchorId="7C677732">
-          <v:rect id="_x0000_i1073" style="width:0;height:1.5pt" o:bullet="t" o:hrstd="t" o:hr="t" fillcolor="#a0a0a0" stroked="f"/>
-        </w:pict>
-      </w:r>
-    </w:p>
-    <w:p>
-      <w:pPr>
-        <w:spacing w:after="0"/>
-      </w:pPr>
-      <w:r>
-        <w:rPr>
-          <w:b/>
-          <w:bCs/>
-        </w:rPr>
-        <w:t>1</w:t>
-      </w:r>
-      <w:r>
-        <w:rPr>
-          <w:b/>
-          <w:bCs/>
-        </w:rPr>
-        <w:t>9</w:t>
-      </w:r>
-      <w:r>
-        <w:rPr>
-          <w:b/>
-          <w:bCs/>
-        </w:rPr>
-        <w:t xml:space="preserve">. </w:t>
+        <w:t>('/login').</w:t>
       </w:r>
     </w:p>
     <w:p>
@@ -24090,30 +24819,10 @@
 
 <file path=word/numbering.xml><?xml version="1.0" encoding="utf-8"?>
 <w:numbering xmlns:wpc="http://schemas.microsoft.com/office/word/2010/wordprocessingCanvas" xmlns:cx="http://schemas.microsoft.com/office/drawing/2014/chartex" xmlns:cx1="http://schemas.microsoft.com/office/drawing/2015/9/8/chartex" xmlns:cx2="http://schemas.microsoft.com/office/drawing/2015/10/21/chartex" xmlns:cx3="http://schemas.microsoft.com/office/drawing/2016/5/9/chartex" xmlns:cx4="http://schemas.microsoft.com/office/drawing/2016/5/10/chartex" xmlns:cx5="http://schemas.microsoft.com/office/drawing/2016/5/11/chartex" xmlns:cx6="http://schemas.microsoft.com/office/drawing/2016/5/12/chartex" xmlns:cx7="http://schemas.microsoft.com/office/drawing/2016/5/13/chartex" xmlns:cx8="http://schemas.microsoft.com/office/drawing/2016/5/14/chartex" xmlns:mc="http://schemas.openxmlformats.org/markup-compatibility/2006" xmlns:aink="http://schemas.microsoft.com/office/drawing/2016/ink" xmlns:am3d="http://schemas.microsoft.com/office/drawing/2017/model3d" xmlns:o="urn:schemas-microsoft-com:office:office" xmlns:oel="http://schemas.microsoft.com/office/2019/extlst" xmlns:r="http://schemas.openxmlformats.org/officeDocument/2006/relationships" xmlns:m="http://schemas.openxmlformats.org/officeDocument/2006/math" xmlns:v="urn:schemas-microsoft-com:vml" xmlns:wp14="http://schemas.microsoft.com/office/word/2010/wordprocessingDrawing" xmlns:wp="http://schemas.openxmlformats.org/drawingml/2006/wordprocessingDrawing" xmlns:w10="urn:schemas-microsoft-com:office:word" xmlns:w="http://schemas.openxmlformats.org/wordprocessingml/2006/main" xmlns:w14="http://schemas.microsoft.com/office/word/2010/wordml" xmlns:w15="http://schemas.microsoft.com/office/word/2012/wordml" xmlns:w16cex="http://schemas.microsoft.com/office/word/2018/wordml/cex" xmlns:w16cid="http://schemas.microsoft.com/office/word/2016/wordml/cid" xmlns:w16="http://schemas.microsoft.com/office/word/2018/wordml" xmlns:w16du="http://schemas.microsoft.com/office/word/2023/wordml/word16du" xmlns:w16sdtdh="http://schemas.microsoft.com/office/word/2020/wordml/sdtdatahash" xmlns:w16sdtfl="http://schemas.microsoft.com/office/word/2024/wordml/sdtformatlock" xmlns:w16se="http://schemas.microsoft.com/office/word/2015/wordml/symex" xmlns:wpg="http://schemas.microsoft.com/office/word/2010/wordprocessingGroup" xmlns:wpi="http://schemas.microsoft.com/office/word/2010/wordprocessingInk" xmlns:wne="http://schemas.microsoft.com/office/word/2006/wordml" xmlns:wps="http://schemas.microsoft.com/office/word/2010/wordprocessingShape" mc:Ignorable="w14 w15 w16se w16cid w16 w16cex w16sdtdh w16sdtfl w16du wp14">
-  <w:numPicBullet w:numPicBulletId="0">
-    <w:pict>
-      <v:rect id="_x0000_i1025" style="width:0;height:1.5pt" o:bullet="t" o:hrstd="t" o:hr="t" fillcolor="#a0a0a0" stroked="f"/>
-    </w:pict>
-  </w:numPicBullet>
-  <w:numPicBullet w:numPicBulletId="1">
-    <w:pict>
-      <v:rect id="_x0000_i1026" style="width:0;height:1.5pt" o:bullet="t" o:hrstd="t" o:hr="t" fillcolor="#a0a0a0" stroked="f"/>
-    </w:pict>
-  </w:numPicBullet>
-  <w:numPicBullet w:numPicBulletId="2">
-    <w:pict>
-      <v:rect id="_x0000_i1027" style="width:0;height:1.5pt" o:bullet="t" o:hrstd="t" o:hr="t" fillcolor="#a0a0a0" stroked="f"/>
-    </w:pict>
-  </w:numPicBullet>
-  <w:numPicBullet w:numPicBulletId="3">
-    <w:pict>
-      <v:rect id="_x0000_i1028" style="width:0;height:1.5pt" o:bullet="t" o:hrstd="t" o:hr="t" fillcolor="#a0a0a0" stroked="f"/>
-    </w:pict>
-  </w:numPicBullet>
   <w:abstractNum w:abstractNumId="0" w15:restartNumberingAfterBreak="0">
-    <w:nsid w:val="00421587"/>
+    <w:nsid w:val="020402DF"/>
     <w:multiLevelType w:val="multilevel"/>
-    <w:tmpl w:val="2C44AE3C"/>
+    <w:tmpl w:val="284434FE"/>
     <w:lvl w:ilvl="0">
       <w:start w:val="1"/>
       <w:numFmt w:val="bullet"/>
@@ -24260,6 +24969,155 @@
     </w:lvl>
   </w:abstractNum>
   <w:abstractNum w:abstractNumId="1" w15:restartNumberingAfterBreak="0">
+    <w:nsid w:val="02DC51B2"/>
+    <w:multiLevelType w:val="multilevel"/>
+    <w:tmpl w:val="284434FE"/>
+    <w:lvl w:ilvl="0">
+      <w:start w:val="1"/>
+      <w:numFmt w:val="bullet"/>
+      <w:lvlText w:val=""/>
+      <w:lvlJc w:val="left"/>
+      <w:pPr>
+        <w:tabs>
+          <w:tab w:val="num" w:pos="720"/>
+        </w:tabs>
+        <w:ind w:left="720" w:hanging="360"/>
+      </w:pPr>
+      <w:rPr>
+        <w:rFonts w:ascii="Symbol" w:hAnsi="Symbol" w:hint="default"/>
+        <w:sz w:val="20"/>
+      </w:rPr>
+    </w:lvl>
+    <w:lvl w:ilvl="1" w:tentative="1">
+      <w:start w:val="1"/>
+      <w:numFmt w:val="bullet"/>
+      <w:lvlText w:val="o"/>
+      <w:lvlJc w:val="left"/>
+      <w:pPr>
+        <w:tabs>
+          <w:tab w:val="num" w:pos="1440"/>
+        </w:tabs>
+        <w:ind w:left="1440" w:hanging="360"/>
+      </w:pPr>
+      <w:rPr>
+        <w:rFonts w:ascii="Courier New" w:hAnsi="Courier New" w:hint="default"/>
+        <w:sz w:val="20"/>
+      </w:rPr>
+    </w:lvl>
+    <w:lvl w:ilvl="2" w:tentative="1">
+      <w:start w:val="1"/>
+      <w:numFmt w:val="bullet"/>
+      <w:lvlText w:val=""/>
+      <w:lvlJc w:val="left"/>
+      <w:pPr>
+        <w:tabs>
+          <w:tab w:val="num" w:pos="2160"/>
+        </w:tabs>
+        <w:ind w:left="2160" w:hanging="360"/>
+      </w:pPr>
+      <w:rPr>
+        <w:rFonts w:ascii="Wingdings" w:hAnsi="Wingdings" w:hint="default"/>
+        <w:sz w:val="20"/>
+      </w:rPr>
+    </w:lvl>
+    <w:lvl w:ilvl="3" w:tentative="1">
+      <w:start w:val="1"/>
+      <w:numFmt w:val="bullet"/>
+      <w:lvlText w:val=""/>
+      <w:lvlJc w:val="left"/>
+      <w:pPr>
+        <w:tabs>
+          <w:tab w:val="num" w:pos="2880"/>
+        </w:tabs>
+        <w:ind w:left="2880" w:hanging="360"/>
+      </w:pPr>
+      <w:rPr>
+        <w:rFonts w:ascii="Wingdings" w:hAnsi="Wingdings" w:hint="default"/>
+        <w:sz w:val="20"/>
+      </w:rPr>
+    </w:lvl>
+    <w:lvl w:ilvl="4" w:tentative="1">
+      <w:start w:val="1"/>
+      <w:numFmt w:val="bullet"/>
+      <w:lvlText w:val=""/>
+      <w:lvlJc w:val="left"/>
+      <w:pPr>
+        <w:tabs>
+          <w:tab w:val="num" w:pos="3600"/>
+        </w:tabs>
+        <w:ind w:left="3600" w:hanging="360"/>
+      </w:pPr>
+      <w:rPr>
+        <w:rFonts w:ascii="Wingdings" w:hAnsi="Wingdings" w:hint="default"/>
+        <w:sz w:val="20"/>
+      </w:rPr>
+    </w:lvl>
+    <w:lvl w:ilvl="5" w:tentative="1">
+      <w:start w:val="1"/>
+      <w:numFmt w:val="bullet"/>
+      <w:lvlText w:val=""/>
+      <w:lvlJc w:val="left"/>
+      <w:pPr>
+        <w:tabs>
+          <w:tab w:val="num" w:pos="4320"/>
+        </w:tabs>
+        <w:ind w:left="4320" w:hanging="360"/>
+      </w:pPr>
+      <w:rPr>
+        <w:rFonts w:ascii="Wingdings" w:hAnsi="Wingdings" w:hint="default"/>
+        <w:sz w:val="20"/>
+      </w:rPr>
+    </w:lvl>
+    <w:lvl w:ilvl="6" w:tentative="1">
+      <w:start w:val="1"/>
+      <w:numFmt w:val="bullet"/>
+      <w:lvlText w:val=""/>
+      <w:lvlJc w:val="left"/>
+      <w:pPr>
+        <w:tabs>
+          <w:tab w:val="num" w:pos="5040"/>
+        </w:tabs>
+        <w:ind w:left="5040" w:hanging="360"/>
+      </w:pPr>
+      <w:rPr>
+        <w:rFonts w:ascii="Wingdings" w:hAnsi="Wingdings" w:hint="default"/>
+        <w:sz w:val="20"/>
+      </w:rPr>
+    </w:lvl>
+    <w:lvl w:ilvl="7" w:tentative="1">
+      <w:start w:val="1"/>
+      <w:numFmt w:val="bullet"/>
+      <w:lvlText w:val=""/>
+      <w:lvlJc w:val="left"/>
+      <w:pPr>
+        <w:tabs>
+          <w:tab w:val="num" w:pos="5760"/>
+        </w:tabs>
+        <w:ind w:left="5760" w:hanging="360"/>
+      </w:pPr>
+      <w:rPr>
+        <w:rFonts w:ascii="Wingdings" w:hAnsi="Wingdings" w:hint="default"/>
+        <w:sz w:val="20"/>
+      </w:rPr>
+    </w:lvl>
+    <w:lvl w:ilvl="8" w:tentative="1">
+      <w:start w:val="1"/>
+      <w:numFmt w:val="bullet"/>
+      <w:lvlText w:val=""/>
+      <w:lvlJc w:val="left"/>
+      <w:pPr>
+        <w:tabs>
+          <w:tab w:val="num" w:pos="6480"/>
+        </w:tabs>
+        <w:ind w:left="6480" w:hanging="360"/>
+      </w:pPr>
+      <w:rPr>
+        <w:rFonts w:ascii="Wingdings" w:hAnsi="Wingdings" w:hint="default"/>
+        <w:sz w:val="20"/>
+      </w:rPr>
+    </w:lvl>
+  </w:abstractNum>
+  <w:abstractNum w:abstractNumId="2" w15:restartNumberingAfterBreak="0">
     <w:nsid w:val="04FB4CAC"/>
     <w:multiLevelType w:val="multilevel"/>
     <w:tmpl w:val="5536920E"/>
@@ -24372,7 +25230,7 @@
       </w:pPr>
     </w:lvl>
   </w:abstractNum>
-  <w:abstractNum w:abstractNumId="2" w15:restartNumberingAfterBreak="0">
+  <w:abstractNum w:abstractNumId="3" w15:restartNumberingAfterBreak="0">
     <w:nsid w:val="067B56F7"/>
     <w:multiLevelType w:val="multilevel"/>
     <w:tmpl w:val="284434FE"/>
@@ -24521,7 +25379,7 @@
       </w:rPr>
     </w:lvl>
   </w:abstractNum>
-  <w:abstractNum w:abstractNumId="3" w15:restartNumberingAfterBreak="0">
+  <w:abstractNum w:abstractNumId="4" w15:restartNumberingAfterBreak="0">
     <w:nsid w:val="07184DE8"/>
     <w:multiLevelType w:val="multilevel"/>
     <w:tmpl w:val="F674812C"/>
@@ -24634,7 +25492,7 @@
       </w:pPr>
     </w:lvl>
   </w:abstractNum>
-  <w:abstractNum w:abstractNumId="4" w15:restartNumberingAfterBreak="0">
+  <w:abstractNum w:abstractNumId="5" w15:restartNumberingAfterBreak="0">
     <w:nsid w:val="0B492AF0"/>
     <w:multiLevelType w:val="multilevel"/>
     <w:tmpl w:val="EFD69A36"/>
@@ -24783,7 +25641,7 @@
       </w:rPr>
     </w:lvl>
   </w:abstractNum>
-  <w:abstractNum w:abstractNumId="5" w15:restartNumberingAfterBreak="0">
+  <w:abstractNum w:abstractNumId="6" w15:restartNumberingAfterBreak="0">
     <w:nsid w:val="0C7927F3"/>
     <w:multiLevelType w:val="multilevel"/>
     <w:tmpl w:val="9E7097E0"/>
@@ -24932,7 +25790,7 @@
       </w:rPr>
     </w:lvl>
   </w:abstractNum>
-  <w:abstractNum w:abstractNumId="6" w15:restartNumberingAfterBreak="0">
+  <w:abstractNum w:abstractNumId="7" w15:restartNumberingAfterBreak="0">
     <w:nsid w:val="0FCF1907"/>
     <w:multiLevelType w:val="multilevel"/>
     <w:tmpl w:val="88A0DCC4"/>
@@ -25049,7 +25907,7 @@
       </w:pPr>
     </w:lvl>
   </w:abstractNum>
-  <w:abstractNum w:abstractNumId="7" w15:restartNumberingAfterBreak="0">
+  <w:abstractNum w:abstractNumId="8" w15:restartNumberingAfterBreak="0">
     <w:nsid w:val="107E64E8"/>
     <w:multiLevelType w:val="multilevel"/>
     <w:tmpl w:val="E09665AC"/>
@@ -25198,7 +26056,7 @@
       </w:rPr>
     </w:lvl>
   </w:abstractNum>
-  <w:abstractNum w:abstractNumId="8" w15:restartNumberingAfterBreak="0">
+  <w:abstractNum w:abstractNumId="9" w15:restartNumberingAfterBreak="0">
     <w:nsid w:val="18D009B6"/>
     <w:multiLevelType w:val="multilevel"/>
     <w:tmpl w:val="8BBAD87E"/>
@@ -25347,7 +26205,7 @@
       </w:rPr>
     </w:lvl>
   </w:abstractNum>
-  <w:abstractNum w:abstractNumId="9" w15:restartNumberingAfterBreak="0">
+  <w:abstractNum w:abstractNumId="10" w15:restartNumberingAfterBreak="0">
     <w:nsid w:val="1A8C1E10"/>
     <w:multiLevelType w:val="multilevel"/>
     <w:tmpl w:val="1FC2C6E0"/>
@@ -25496,7 +26354,7 @@
       </w:rPr>
     </w:lvl>
   </w:abstractNum>
-  <w:abstractNum w:abstractNumId="10" w15:restartNumberingAfterBreak="0">
+  <w:abstractNum w:abstractNumId="11" w15:restartNumberingAfterBreak="0">
     <w:nsid w:val="1B037E19"/>
     <w:multiLevelType w:val="multilevel"/>
     <w:tmpl w:val="284434FE"/>
@@ -25645,7 +26503,7 @@
       </w:rPr>
     </w:lvl>
   </w:abstractNum>
-  <w:abstractNum w:abstractNumId="11" w15:restartNumberingAfterBreak="0">
+  <w:abstractNum w:abstractNumId="12" w15:restartNumberingAfterBreak="0">
     <w:nsid w:val="1CCF769D"/>
     <w:multiLevelType w:val="multilevel"/>
     <w:tmpl w:val="81B2FB98"/>
@@ -25794,7 +26652,7 @@
       </w:rPr>
     </w:lvl>
   </w:abstractNum>
-  <w:abstractNum w:abstractNumId="12" w15:restartNumberingAfterBreak="0">
+  <w:abstractNum w:abstractNumId="13" w15:restartNumberingAfterBreak="0">
     <w:nsid w:val="1FB818D5"/>
     <w:multiLevelType w:val="multilevel"/>
     <w:tmpl w:val="9C2CCD1C"/>
@@ -25907,7 +26765,7 @@
       </w:pPr>
     </w:lvl>
   </w:abstractNum>
-  <w:abstractNum w:abstractNumId="13" w15:restartNumberingAfterBreak="0">
+  <w:abstractNum w:abstractNumId="14" w15:restartNumberingAfterBreak="0">
     <w:nsid w:val="231211C9"/>
     <w:multiLevelType w:val="multilevel"/>
     <w:tmpl w:val="284434FE"/>
@@ -26056,7 +26914,7 @@
       </w:rPr>
     </w:lvl>
   </w:abstractNum>
-  <w:abstractNum w:abstractNumId="14" w15:restartNumberingAfterBreak="0">
+  <w:abstractNum w:abstractNumId="15" w15:restartNumberingAfterBreak="0">
     <w:nsid w:val="23896E71"/>
     <w:multiLevelType w:val="multilevel"/>
     <w:tmpl w:val="87D21BCC"/>
@@ -26205,7 +27063,7 @@
       </w:rPr>
     </w:lvl>
   </w:abstractNum>
-  <w:abstractNum w:abstractNumId="15" w15:restartNumberingAfterBreak="0">
+  <w:abstractNum w:abstractNumId="16" w15:restartNumberingAfterBreak="0">
     <w:nsid w:val="283C448A"/>
     <w:multiLevelType w:val="multilevel"/>
     <w:tmpl w:val="5518EB7A"/>
@@ -26354,7 +27212,7 @@
       </w:rPr>
     </w:lvl>
   </w:abstractNum>
-  <w:abstractNum w:abstractNumId="16" w15:restartNumberingAfterBreak="0">
+  <w:abstractNum w:abstractNumId="17" w15:restartNumberingAfterBreak="0">
     <w:nsid w:val="2A7E5B87"/>
     <w:multiLevelType w:val="multilevel"/>
     <w:tmpl w:val="236AE22C"/>
@@ -26503,7 +27361,7 @@
       </w:rPr>
     </w:lvl>
   </w:abstractNum>
-  <w:abstractNum w:abstractNumId="17" w15:restartNumberingAfterBreak="0">
+  <w:abstractNum w:abstractNumId="18" w15:restartNumberingAfterBreak="0">
     <w:nsid w:val="2B5A5E0B"/>
     <w:multiLevelType w:val="multilevel"/>
     <w:tmpl w:val="24F04C84"/>
@@ -26652,7 +27510,7 @@
       </w:rPr>
     </w:lvl>
   </w:abstractNum>
-  <w:abstractNum w:abstractNumId="18" w15:restartNumberingAfterBreak="0">
+  <w:abstractNum w:abstractNumId="19" w15:restartNumberingAfterBreak="0">
     <w:nsid w:val="2F550B18"/>
     <w:multiLevelType w:val="multilevel"/>
     <w:tmpl w:val="78CA4050"/>
@@ -26801,7 +27659,7 @@
       </w:rPr>
     </w:lvl>
   </w:abstractNum>
-  <w:abstractNum w:abstractNumId="19" w15:restartNumberingAfterBreak="0">
+  <w:abstractNum w:abstractNumId="20" w15:restartNumberingAfterBreak="0">
     <w:nsid w:val="2F6159A4"/>
     <w:multiLevelType w:val="multilevel"/>
     <w:tmpl w:val="623ADA6E"/>
@@ -26914,7 +27772,7 @@
       </w:pPr>
     </w:lvl>
   </w:abstractNum>
-  <w:abstractNum w:abstractNumId="20" w15:restartNumberingAfterBreak="0">
+  <w:abstractNum w:abstractNumId="21" w15:restartNumberingAfterBreak="0">
     <w:nsid w:val="2F655F95"/>
     <w:multiLevelType w:val="multilevel"/>
     <w:tmpl w:val="9C2CCD1C"/>
@@ -27027,7 +27885,7 @@
       </w:pPr>
     </w:lvl>
   </w:abstractNum>
-  <w:abstractNum w:abstractNumId="21" w15:restartNumberingAfterBreak="0">
+  <w:abstractNum w:abstractNumId="22" w15:restartNumberingAfterBreak="0">
     <w:nsid w:val="34205F5B"/>
     <w:multiLevelType w:val="multilevel"/>
     <w:tmpl w:val="D7E4E6AA"/>
@@ -27176,7 +28034,7 @@
       </w:rPr>
     </w:lvl>
   </w:abstractNum>
-  <w:abstractNum w:abstractNumId="22" w15:restartNumberingAfterBreak="0">
+  <w:abstractNum w:abstractNumId="23" w15:restartNumberingAfterBreak="0">
     <w:nsid w:val="35EC4C35"/>
     <w:multiLevelType w:val="multilevel"/>
     <w:tmpl w:val="C044817E"/>
@@ -27325,7 +28183,7 @@
       </w:rPr>
     </w:lvl>
   </w:abstractNum>
-  <w:abstractNum w:abstractNumId="23" w15:restartNumberingAfterBreak="0">
+  <w:abstractNum w:abstractNumId="24" w15:restartNumberingAfterBreak="0">
     <w:nsid w:val="4001201C"/>
     <w:multiLevelType w:val="multilevel"/>
     <w:tmpl w:val="04082470"/>
@@ -27438,7 +28296,7 @@
       </w:pPr>
     </w:lvl>
   </w:abstractNum>
-  <w:abstractNum w:abstractNumId="24" w15:restartNumberingAfterBreak="0">
+  <w:abstractNum w:abstractNumId="25" w15:restartNumberingAfterBreak="0">
     <w:nsid w:val="4AA84A18"/>
     <w:multiLevelType w:val="multilevel"/>
     <w:tmpl w:val="806AE8EA"/>
@@ -27587,7 +28445,7 @@
       </w:rPr>
     </w:lvl>
   </w:abstractNum>
-  <w:abstractNum w:abstractNumId="25" w15:restartNumberingAfterBreak="0">
+  <w:abstractNum w:abstractNumId="26" w15:restartNumberingAfterBreak="0">
     <w:nsid w:val="4ACC3D8E"/>
     <w:multiLevelType w:val="multilevel"/>
     <w:tmpl w:val="689CC926"/>
@@ -27736,7 +28594,7 @@
       </w:rPr>
     </w:lvl>
   </w:abstractNum>
-  <w:abstractNum w:abstractNumId="26" w15:restartNumberingAfterBreak="0">
+  <w:abstractNum w:abstractNumId="27" w15:restartNumberingAfterBreak="0">
     <w:nsid w:val="4D1A269D"/>
     <w:multiLevelType w:val="multilevel"/>
     <w:tmpl w:val="284434FE"/>
@@ -27885,7 +28743,7 @@
       </w:rPr>
     </w:lvl>
   </w:abstractNum>
-  <w:abstractNum w:abstractNumId="27" w15:restartNumberingAfterBreak="0">
+  <w:abstractNum w:abstractNumId="28" w15:restartNumberingAfterBreak="0">
     <w:nsid w:val="508D7154"/>
     <w:multiLevelType w:val="multilevel"/>
     <w:tmpl w:val="05BA29AE"/>
@@ -28034,7 +28892,7 @@
       </w:rPr>
     </w:lvl>
   </w:abstractNum>
-  <w:abstractNum w:abstractNumId="28" w15:restartNumberingAfterBreak="0">
+  <w:abstractNum w:abstractNumId="29" w15:restartNumberingAfterBreak="0">
     <w:nsid w:val="50AF1916"/>
     <w:multiLevelType w:val="multilevel"/>
     <w:tmpl w:val="1CDEC6D6"/>
@@ -28183,7 +29041,7 @@
       </w:rPr>
     </w:lvl>
   </w:abstractNum>
-  <w:abstractNum w:abstractNumId="29" w15:restartNumberingAfterBreak="0">
+  <w:abstractNum w:abstractNumId="30" w15:restartNumberingAfterBreak="0">
     <w:nsid w:val="52B35D9C"/>
     <w:multiLevelType w:val="multilevel"/>
     <w:tmpl w:val="F036D8DA"/>
@@ -28332,7 +29190,7 @@
       </w:rPr>
     </w:lvl>
   </w:abstractNum>
-  <w:abstractNum w:abstractNumId="30" w15:restartNumberingAfterBreak="0">
+  <w:abstractNum w:abstractNumId="31" w15:restartNumberingAfterBreak="0">
     <w:nsid w:val="54050725"/>
     <w:multiLevelType w:val="multilevel"/>
     <w:tmpl w:val="82C40B8A"/>
@@ -28481,7 +29339,7 @@
       </w:rPr>
     </w:lvl>
   </w:abstractNum>
-  <w:abstractNum w:abstractNumId="31" w15:restartNumberingAfterBreak="0">
+  <w:abstractNum w:abstractNumId="32" w15:restartNumberingAfterBreak="0">
     <w:nsid w:val="549B7A3F"/>
     <w:multiLevelType w:val="multilevel"/>
     <w:tmpl w:val="0F20AB3A"/>
@@ -28630,7 +29488,7 @@
       </w:rPr>
     </w:lvl>
   </w:abstractNum>
-  <w:abstractNum w:abstractNumId="32" w15:restartNumberingAfterBreak="0">
+  <w:abstractNum w:abstractNumId="33" w15:restartNumberingAfterBreak="0">
     <w:nsid w:val="562D489C"/>
     <w:multiLevelType w:val="multilevel"/>
     <w:tmpl w:val="86F008FA"/>
@@ -28779,7 +29637,7 @@
       </w:rPr>
     </w:lvl>
   </w:abstractNum>
-  <w:abstractNum w:abstractNumId="33" w15:restartNumberingAfterBreak="0">
+  <w:abstractNum w:abstractNumId="34" w15:restartNumberingAfterBreak="0">
     <w:nsid w:val="5E4B3C32"/>
     <w:multiLevelType w:val="multilevel"/>
     <w:tmpl w:val="2C82D658"/>
@@ -28928,7 +29786,7 @@
       </w:rPr>
     </w:lvl>
   </w:abstractNum>
-  <w:abstractNum w:abstractNumId="34" w15:restartNumberingAfterBreak="0">
+  <w:abstractNum w:abstractNumId="35" w15:restartNumberingAfterBreak="0">
     <w:nsid w:val="600B5A80"/>
     <w:multiLevelType w:val="multilevel"/>
     <w:tmpl w:val="4D9E1450"/>
@@ -29077,7 +29935,7 @@
       </w:rPr>
     </w:lvl>
   </w:abstractNum>
-  <w:abstractNum w:abstractNumId="35" w15:restartNumberingAfterBreak="0">
+  <w:abstractNum w:abstractNumId="36" w15:restartNumberingAfterBreak="0">
     <w:nsid w:val="628D780C"/>
     <w:multiLevelType w:val="multilevel"/>
     <w:tmpl w:val="6338E36A"/>
@@ -29226,7 +30084,156 @@
       </w:rPr>
     </w:lvl>
   </w:abstractNum>
-  <w:abstractNum w:abstractNumId="36" w15:restartNumberingAfterBreak="0">
+  <w:abstractNum w:abstractNumId="37" w15:restartNumberingAfterBreak="0">
+    <w:nsid w:val="63811D52"/>
+    <w:multiLevelType w:val="multilevel"/>
+    <w:tmpl w:val="284434FE"/>
+    <w:lvl w:ilvl="0">
+      <w:start w:val="1"/>
+      <w:numFmt w:val="bullet"/>
+      <w:lvlText w:val=""/>
+      <w:lvlJc w:val="left"/>
+      <w:pPr>
+        <w:tabs>
+          <w:tab w:val="num" w:pos="720"/>
+        </w:tabs>
+        <w:ind w:left="720" w:hanging="360"/>
+      </w:pPr>
+      <w:rPr>
+        <w:rFonts w:ascii="Symbol" w:hAnsi="Symbol" w:hint="default"/>
+        <w:sz w:val="20"/>
+      </w:rPr>
+    </w:lvl>
+    <w:lvl w:ilvl="1" w:tentative="1">
+      <w:start w:val="1"/>
+      <w:numFmt w:val="bullet"/>
+      <w:lvlText w:val="o"/>
+      <w:lvlJc w:val="left"/>
+      <w:pPr>
+        <w:tabs>
+          <w:tab w:val="num" w:pos="1440"/>
+        </w:tabs>
+        <w:ind w:left="1440" w:hanging="360"/>
+      </w:pPr>
+      <w:rPr>
+        <w:rFonts w:ascii="Courier New" w:hAnsi="Courier New" w:hint="default"/>
+        <w:sz w:val="20"/>
+      </w:rPr>
+    </w:lvl>
+    <w:lvl w:ilvl="2" w:tentative="1">
+      <w:start w:val="1"/>
+      <w:numFmt w:val="bullet"/>
+      <w:lvlText w:val=""/>
+      <w:lvlJc w:val="left"/>
+      <w:pPr>
+        <w:tabs>
+          <w:tab w:val="num" w:pos="2160"/>
+        </w:tabs>
+        <w:ind w:left="2160" w:hanging="360"/>
+      </w:pPr>
+      <w:rPr>
+        <w:rFonts w:ascii="Wingdings" w:hAnsi="Wingdings" w:hint="default"/>
+        <w:sz w:val="20"/>
+      </w:rPr>
+    </w:lvl>
+    <w:lvl w:ilvl="3" w:tentative="1">
+      <w:start w:val="1"/>
+      <w:numFmt w:val="bullet"/>
+      <w:lvlText w:val=""/>
+      <w:lvlJc w:val="left"/>
+      <w:pPr>
+        <w:tabs>
+          <w:tab w:val="num" w:pos="2880"/>
+        </w:tabs>
+        <w:ind w:left="2880" w:hanging="360"/>
+      </w:pPr>
+      <w:rPr>
+        <w:rFonts w:ascii="Wingdings" w:hAnsi="Wingdings" w:hint="default"/>
+        <w:sz w:val="20"/>
+      </w:rPr>
+    </w:lvl>
+    <w:lvl w:ilvl="4" w:tentative="1">
+      <w:start w:val="1"/>
+      <w:numFmt w:val="bullet"/>
+      <w:lvlText w:val=""/>
+      <w:lvlJc w:val="left"/>
+      <w:pPr>
+        <w:tabs>
+          <w:tab w:val="num" w:pos="3600"/>
+        </w:tabs>
+        <w:ind w:left="3600" w:hanging="360"/>
+      </w:pPr>
+      <w:rPr>
+        <w:rFonts w:ascii="Wingdings" w:hAnsi="Wingdings" w:hint="default"/>
+        <w:sz w:val="20"/>
+      </w:rPr>
+    </w:lvl>
+    <w:lvl w:ilvl="5" w:tentative="1">
+      <w:start w:val="1"/>
+      <w:numFmt w:val="bullet"/>
+      <w:lvlText w:val=""/>
+      <w:lvlJc w:val="left"/>
+      <w:pPr>
+        <w:tabs>
+          <w:tab w:val="num" w:pos="4320"/>
+        </w:tabs>
+        <w:ind w:left="4320" w:hanging="360"/>
+      </w:pPr>
+      <w:rPr>
+        <w:rFonts w:ascii="Wingdings" w:hAnsi="Wingdings" w:hint="default"/>
+        <w:sz w:val="20"/>
+      </w:rPr>
+    </w:lvl>
+    <w:lvl w:ilvl="6" w:tentative="1">
+      <w:start w:val="1"/>
+      <w:numFmt w:val="bullet"/>
+      <w:lvlText w:val=""/>
+      <w:lvlJc w:val="left"/>
+      <w:pPr>
+        <w:tabs>
+          <w:tab w:val="num" w:pos="5040"/>
+        </w:tabs>
+        <w:ind w:left="5040" w:hanging="360"/>
+      </w:pPr>
+      <w:rPr>
+        <w:rFonts w:ascii="Wingdings" w:hAnsi="Wingdings" w:hint="default"/>
+        <w:sz w:val="20"/>
+      </w:rPr>
+    </w:lvl>
+    <w:lvl w:ilvl="7" w:tentative="1">
+      <w:start w:val="1"/>
+      <w:numFmt w:val="bullet"/>
+      <w:lvlText w:val=""/>
+      <w:lvlJc w:val="left"/>
+      <w:pPr>
+        <w:tabs>
+          <w:tab w:val="num" w:pos="5760"/>
+        </w:tabs>
+        <w:ind w:left="5760" w:hanging="360"/>
+      </w:pPr>
+      <w:rPr>
+        <w:rFonts w:ascii="Wingdings" w:hAnsi="Wingdings" w:hint="default"/>
+        <w:sz w:val="20"/>
+      </w:rPr>
+    </w:lvl>
+    <w:lvl w:ilvl="8" w:tentative="1">
+      <w:start w:val="1"/>
+      <w:numFmt w:val="bullet"/>
+      <w:lvlText w:val=""/>
+      <w:lvlJc w:val="left"/>
+      <w:pPr>
+        <w:tabs>
+          <w:tab w:val="num" w:pos="6480"/>
+        </w:tabs>
+        <w:ind w:left="6480" w:hanging="360"/>
+      </w:pPr>
+      <w:rPr>
+        <w:rFonts w:ascii="Wingdings" w:hAnsi="Wingdings" w:hint="default"/>
+        <w:sz w:val="20"/>
+      </w:rPr>
+    </w:lvl>
+  </w:abstractNum>
+  <w:abstractNum w:abstractNumId="38" w15:restartNumberingAfterBreak="0">
     <w:nsid w:val="63D52A4F"/>
     <w:multiLevelType w:val="multilevel"/>
     <w:tmpl w:val="BE346338"/>
@@ -29375,7 +30382,7 @@
       </w:rPr>
     </w:lvl>
   </w:abstractNum>
-  <w:abstractNum w:abstractNumId="37" w15:restartNumberingAfterBreak="0">
+  <w:abstractNum w:abstractNumId="39" w15:restartNumberingAfterBreak="0">
     <w:nsid w:val="64C63B97"/>
     <w:multiLevelType w:val="multilevel"/>
     <w:tmpl w:val="81889C6E"/>
@@ -29488,7 +30495,7 @@
       </w:pPr>
     </w:lvl>
   </w:abstractNum>
-  <w:abstractNum w:abstractNumId="38" w15:restartNumberingAfterBreak="0">
+  <w:abstractNum w:abstractNumId="40" w15:restartNumberingAfterBreak="0">
     <w:nsid w:val="685308A7"/>
     <w:multiLevelType w:val="multilevel"/>
     <w:tmpl w:val="27A080CC"/>
@@ -29637,7 +30644,7 @@
       </w:rPr>
     </w:lvl>
   </w:abstractNum>
-  <w:abstractNum w:abstractNumId="39" w15:restartNumberingAfterBreak="0">
+  <w:abstractNum w:abstractNumId="41" w15:restartNumberingAfterBreak="0">
     <w:nsid w:val="688914B3"/>
     <w:multiLevelType w:val="multilevel"/>
     <w:tmpl w:val="BC92A496"/>
@@ -29786,7 +30793,7 @@
       </w:rPr>
     </w:lvl>
   </w:abstractNum>
-  <w:abstractNum w:abstractNumId="40" w15:restartNumberingAfterBreak="0">
+  <w:abstractNum w:abstractNumId="42" w15:restartNumberingAfterBreak="0">
     <w:nsid w:val="750B7303"/>
     <w:multiLevelType w:val="multilevel"/>
     <w:tmpl w:val="109A2098"/>
@@ -29935,7 +30942,7 @@
       </w:rPr>
     </w:lvl>
   </w:abstractNum>
-  <w:abstractNum w:abstractNumId="41" w15:restartNumberingAfterBreak="0">
+  <w:abstractNum w:abstractNumId="43" w15:restartNumberingAfterBreak="0">
     <w:nsid w:val="76E61CAC"/>
     <w:multiLevelType w:val="multilevel"/>
     <w:tmpl w:val="76503626"/>
@@ -30048,7 +31055,7 @@
       </w:pPr>
     </w:lvl>
   </w:abstractNum>
-  <w:abstractNum w:abstractNumId="42" w15:restartNumberingAfterBreak="0">
+  <w:abstractNum w:abstractNumId="44" w15:restartNumberingAfterBreak="0">
     <w:nsid w:val="77D029A7"/>
     <w:multiLevelType w:val="multilevel"/>
     <w:tmpl w:val="330CDB2A"/>
@@ -30161,7 +31168,7 @@
       </w:pPr>
     </w:lvl>
   </w:abstractNum>
-  <w:abstractNum w:abstractNumId="43" w15:restartNumberingAfterBreak="0">
+  <w:abstractNum w:abstractNumId="45" w15:restartNumberingAfterBreak="0">
     <w:nsid w:val="7834320F"/>
     <w:multiLevelType w:val="multilevel"/>
     <w:tmpl w:val="27728F5E"/>
@@ -30274,7 +31281,7 @@
       </w:pPr>
     </w:lvl>
   </w:abstractNum>
-  <w:abstractNum w:abstractNumId="44" w15:restartNumberingAfterBreak="0">
+  <w:abstractNum w:abstractNumId="46" w15:restartNumberingAfterBreak="0">
     <w:nsid w:val="79243DA1"/>
     <w:multiLevelType w:val="multilevel"/>
     <w:tmpl w:val="284434FE"/>
@@ -30423,7 +31430,7 @@
       </w:rPr>
     </w:lvl>
   </w:abstractNum>
-  <w:abstractNum w:abstractNumId="45" w15:restartNumberingAfterBreak="0">
+  <w:abstractNum w:abstractNumId="47" w15:restartNumberingAfterBreak="0">
     <w:nsid w:val="7A4C1AFD"/>
     <w:multiLevelType w:val="multilevel"/>
     <w:tmpl w:val="188635DE"/>
@@ -30572,7 +31579,7 @@
       </w:rPr>
     </w:lvl>
   </w:abstractNum>
-  <w:abstractNum w:abstractNumId="46" w15:restartNumberingAfterBreak="0">
+  <w:abstractNum w:abstractNumId="48" w15:restartNumberingAfterBreak="0">
     <w:nsid w:val="7C50535F"/>
     <w:multiLevelType w:val="multilevel"/>
     <w:tmpl w:val="78C22C92"/>
@@ -30685,7 +31692,7 @@
       </w:pPr>
     </w:lvl>
   </w:abstractNum>
-  <w:abstractNum w:abstractNumId="47" w15:restartNumberingAfterBreak="0">
+  <w:abstractNum w:abstractNumId="49" w15:restartNumberingAfterBreak="0">
     <w:nsid w:val="7D190E8C"/>
     <w:multiLevelType w:val="multilevel"/>
     <w:tmpl w:val="6F4AE496"/>
@@ -30834,7 +31841,7 @@
       </w:rPr>
     </w:lvl>
   </w:abstractNum>
-  <w:abstractNum w:abstractNumId="48" w15:restartNumberingAfterBreak="0">
+  <w:abstractNum w:abstractNumId="50" w15:restartNumberingAfterBreak="0">
     <w:nsid w:val="7D7E1EB5"/>
     <w:multiLevelType w:val="multilevel"/>
     <w:tmpl w:val="A016FBCA"/>
@@ -30983,7 +31990,7 @@
       </w:rPr>
     </w:lvl>
   </w:abstractNum>
-  <w:abstractNum w:abstractNumId="49" w15:restartNumberingAfterBreak="0">
+  <w:abstractNum w:abstractNumId="51" w15:restartNumberingAfterBreak="0">
     <w:nsid w:val="7E57324C"/>
     <w:multiLevelType w:val="multilevel"/>
     <w:tmpl w:val="A83A47B4"/>
@@ -31133,156 +32140,162 @@
     </w:lvl>
   </w:abstractNum>
   <w:num w:numId="1" w16cid:durableId="1807352600">
+    <w:abstractNumId w:val="47"/>
+  </w:num>
+  <w:num w:numId="2" w16cid:durableId="1289313639">
+    <w:abstractNumId w:val="22"/>
+  </w:num>
+  <w:num w:numId="3" w16cid:durableId="105345779">
+    <w:abstractNumId w:val="36"/>
+  </w:num>
+  <w:num w:numId="4" w16cid:durableId="210845180">
+    <w:abstractNumId w:val="51"/>
+  </w:num>
+  <w:num w:numId="5" w16cid:durableId="323512730">
+    <w:abstractNumId w:val="23"/>
+  </w:num>
+  <w:num w:numId="6" w16cid:durableId="1732658656">
+    <w:abstractNumId w:val="15"/>
+  </w:num>
+  <w:num w:numId="7" w16cid:durableId="1541936381">
+    <w:abstractNumId w:val="39"/>
+  </w:num>
+  <w:num w:numId="8" w16cid:durableId="1871409665">
+    <w:abstractNumId w:val="49"/>
+  </w:num>
+  <w:num w:numId="9" w16cid:durableId="1840072043">
+    <w:abstractNumId w:val="30"/>
+  </w:num>
+  <w:num w:numId="10" w16cid:durableId="972641355">
+    <w:abstractNumId w:val="32"/>
+  </w:num>
+  <w:num w:numId="11" w16cid:durableId="1730952846">
+    <w:abstractNumId w:val="7"/>
+  </w:num>
+  <w:num w:numId="12" w16cid:durableId="1090081387">
+    <w:abstractNumId w:val="12"/>
+  </w:num>
+  <w:num w:numId="13" w16cid:durableId="750352990">
+    <w:abstractNumId w:val="17"/>
+  </w:num>
+  <w:num w:numId="14" w16cid:durableId="885679495">
+    <w:abstractNumId w:val="20"/>
+  </w:num>
+  <w:num w:numId="15" w16cid:durableId="1216351207">
+    <w:abstractNumId w:val="34"/>
+  </w:num>
+  <w:num w:numId="16" w16cid:durableId="1066563910">
+    <w:abstractNumId w:val="28"/>
+  </w:num>
+  <w:num w:numId="17" w16cid:durableId="1275405945">
+    <w:abstractNumId w:val="29"/>
+  </w:num>
+  <w:num w:numId="18" w16cid:durableId="1739939799">
+    <w:abstractNumId w:val="8"/>
+  </w:num>
+  <w:num w:numId="19" w16cid:durableId="78261887">
+    <w:abstractNumId w:val="25"/>
+  </w:num>
+  <w:num w:numId="20" w16cid:durableId="1947617525">
+    <w:abstractNumId w:val="4"/>
+  </w:num>
+  <w:num w:numId="21" w16cid:durableId="661465476">
+    <w:abstractNumId w:val="24"/>
+  </w:num>
+  <w:num w:numId="22" w16cid:durableId="1199202532">
+    <w:abstractNumId w:val="35"/>
+  </w:num>
+  <w:num w:numId="23" w16cid:durableId="1600677296">
+    <w:abstractNumId w:val="33"/>
+  </w:num>
+  <w:num w:numId="24" w16cid:durableId="598756210">
+    <w:abstractNumId w:val="13"/>
+  </w:num>
+  <w:num w:numId="25" w16cid:durableId="1423454322">
+    <w:abstractNumId w:val="5"/>
+  </w:num>
+  <w:num w:numId="26" w16cid:durableId="2030838345">
+    <w:abstractNumId w:val="42"/>
+  </w:num>
+  <w:num w:numId="27" w16cid:durableId="1613170802">
+    <w:abstractNumId w:val="2"/>
+  </w:num>
+  <w:num w:numId="28" w16cid:durableId="1584995561">
+    <w:abstractNumId w:val="38"/>
+  </w:num>
+  <w:num w:numId="29" w16cid:durableId="390422211">
+    <w:abstractNumId w:val="10"/>
+  </w:num>
+  <w:num w:numId="30" w16cid:durableId="1369523729">
+    <w:abstractNumId w:val="19"/>
+  </w:num>
+  <w:num w:numId="31" w16cid:durableId="332877556">
+    <w:abstractNumId w:val="21"/>
+  </w:num>
+  <w:num w:numId="32" w16cid:durableId="1820807917">
+    <w:abstractNumId w:val="18"/>
+  </w:num>
+  <w:num w:numId="33" w16cid:durableId="377435206">
+    <w:abstractNumId w:val="16"/>
+  </w:num>
+  <w:num w:numId="34" w16cid:durableId="1399357143">
     <w:abstractNumId w:val="45"/>
   </w:num>
-  <w:num w:numId="2" w16cid:durableId="1289313639">
-    <w:abstractNumId w:val="21"/>
+  <w:num w:numId="35" w16cid:durableId="1278683558">
+    <w:abstractNumId w:val="40"/>
   </w:num>
-  <w:num w:numId="3" w16cid:durableId="105345779">
-    <w:abstractNumId w:val="35"/>
+  <w:num w:numId="36" w16cid:durableId="954168010">
+    <w:abstractNumId w:val="3"/>
   </w:num>
-  <w:num w:numId="4" w16cid:durableId="210845180">
-    <w:abstractNumId w:val="49"/>
+  <w:num w:numId="37" w16cid:durableId="660890753">
+    <w:abstractNumId w:val="48"/>
   </w:num>
-  <w:num w:numId="5" w16cid:durableId="323512730">
-    <w:abstractNumId w:val="22"/>
+  <w:num w:numId="38" w16cid:durableId="1690595081">
+    <w:abstractNumId w:val="43"/>
   </w:num>
-  <w:num w:numId="6" w16cid:durableId="1732658656">
+  <w:num w:numId="39" w16cid:durableId="182745152">
+    <w:abstractNumId w:val="31"/>
+  </w:num>
+  <w:num w:numId="40" w16cid:durableId="834420943">
+    <w:abstractNumId w:val="44"/>
+  </w:num>
+  <w:num w:numId="41" w16cid:durableId="2002419068">
+    <w:abstractNumId w:val="9"/>
+  </w:num>
+  <w:num w:numId="42" w16cid:durableId="1091240492">
+    <w:abstractNumId w:val="41"/>
+  </w:num>
+  <w:num w:numId="43" w16cid:durableId="970869620">
+    <w:abstractNumId w:val="26"/>
+  </w:num>
+  <w:num w:numId="44" w16cid:durableId="333996985">
+    <w:abstractNumId w:val="50"/>
+  </w:num>
+  <w:num w:numId="45" w16cid:durableId="1873029967">
+    <w:abstractNumId w:val="6"/>
+  </w:num>
+  <w:num w:numId="46" w16cid:durableId="912086002">
     <w:abstractNumId w:val="14"/>
   </w:num>
-  <w:num w:numId="7" w16cid:durableId="1541936381">
+  <w:num w:numId="47" w16cid:durableId="358042909">
+    <w:abstractNumId w:val="46"/>
+  </w:num>
+  <w:num w:numId="48" w16cid:durableId="555553673">
+    <w:abstractNumId w:val="27"/>
+  </w:num>
+  <w:num w:numId="49" w16cid:durableId="1278945193">
+    <w:abstractNumId w:val="11"/>
+  </w:num>
+  <w:num w:numId="50" w16cid:durableId="362365695">
     <w:abstractNumId w:val="37"/>
   </w:num>
-  <w:num w:numId="8" w16cid:durableId="1871409665">
-    <w:abstractNumId w:val="47"/>
+  <w:num w:numId="51" w16cid:durableId="1350571105">
+    <w:abstractNumId w:val="0"/>
   </w:num>
-  <w:num w:numId="9" w16cid:durableId="1840072043">
-    <w:abstractNumId w:val="29"/>
-  </w:num>
-  <w:num w:numId="10" w16cid:durableId="972641355">
-    <w:abstractNumId w:val="31"/>
-  </w:num>
-  <w:num w:numId="11" w16cid:durableId="1730952846">
-    <w:abstractNumId w:val="6"/>
-  </w:num>
-  <w:num w:numId="12" w16cid:durableId="1090081387">
-    <w:abstractNumId w:val="11"/>
-  </w:num>
-  <w:num w:numId="13" w16cid:durableId="750352990">
-    <w:abstractNumId w:val="16"/>
-  </w:num>
-  <w:num w:numId="14" w16cid:durableId="885679495">
-    <w:abstractNumId w:val="19"/>
-  </w:num>
-  <w:num w:numId="15" w16cid:durableId="1216351207">
-    <w:abstractNumId w:val="33"/>
-  </w:num>
-  <w:num w:numId="16" w16cid:durableId="1066563910">
-    <w:abstractNumId w:val="27"/>
-  </w:num>
-  <w:num w:numId="17" w16cid:durableId="1275405945">
-    <w:abstractNumId w:val="28"/>
-  </w:num>
-  <w:num w:numId="18" w16cid:durableId="1739939799">
-    <w:abstractNumId w:val="7"/>
-  </w:num>
-  <w:num w:numId="19" w16cid:durableId="78261887">
-    <w:abstractNumId w:val="24"/>
-  </w:num>
-  <w:num w:numId="20" w16cid:durableId="1947617525">
-    <w:abstractNumId w:val="3"/>
-  </w:num>
-  <w:num w:numId="21" w16cid:durableId="661465476">
-    <w:abstractNumId w:val="23"/>
-  </w:num>
-  <w:num w:numId="22" w16cid:durableId="1199202532">
-    <w:abstractNumId w:val="34"/>
-  </w:num>
-  <w:num w:numId="23" w16cid:durableId="1600677296">
-    <w:abstractNumId w:val="32"/>
-  </w:num>
-  <w:num w:numId="24" w16cid:durableId="598756210">
-    <w:abstractNumId w:val="12"/>
-  </w:num>
-  <w:num w:numId="25" w16cid:durableId="1423454322">
-    <w:abstractNumId w:val="4"/>
-  </w:num>
-  <w:num w:numId="26" w16cid:durableId="2030838345">
-    <w:abstractNumId w:val="40"/>
-  </w:num>
-  <w:num w:numId="27" w16cid:durableId="1613170802">
+  <w:num w:numId="52" w16cid:durableId="1804733601">
     <w:abstractNumId w:val="1"/>
   </w:num>
-  <w:num w:numId="28" w16cid:durableId="1584995561">
-    <w:abstractNumId w:val="36"/>
-  </w:num>
-  <w:num w:numId="29" w16cid:durableId="390422211">
-    <w:abstractNumId w:val="9"/>
-  </w:num>
-  <w:num w:numId="30" w16cid:durableId="1369523729">
-    <w:abstractNumId w:val="18"/>
-  </w:num>
-  <w:num w:numId="31" w16cid:durableId="332877556">
-    <w:abstractNumId w:val="20"/>
-  </w:num>
-  <w:num w:numId="32" w16cid:durableId="1820807917">
-    <w:abstractNumId w:val="17"/>
-  </w:num>
-  <w:num w:numId="33" w16cid:durableId="377435206">
-    <w:abstractNumId w:val="15"/>
-  </w:num>
-  <w:num w:numId="34" w16cid:durableId="1399357143">
-    <w:abstractNumId w:val="43"/>
-  </w:num>
-  <w:num w:numId="35" w16cid:durableId="1278683558">
-    <w:abstractNumId w:val="38"/>
-  </w:num>
-  <w:num w:numId="36" w16cid:durableId="954168010">
-    <w:abstractNumId w:val="2"/>
-  </w:num>
-  <w:num w:numId="37" w16cid:durableId="660890753">
-    <w:abstractNumId w:val="46"/>
-  </w:num>
-  <w:num w:numId="38" w16cid:durableId="1690595081">
-    <w:abstractNumId w:val="41"/>
-  </w:num>
-  <w:num w:numId="39" w16cid:durableId="182745152">
-    <w:abstractNumId w:val="30"/>
-  </w:num>
-  <w:num w:numId="40" w16cid:durableId="834420943">
-    <w:abstractNumId w:val="42"/>
-  </w:num>
-  <w:num w:numId="41" w16cid:durableId="2002419068">
-    <w:abstractNumId w:val="8"/>
-  </w:num>
-  <w:num w:numId="42" w16cid:durableId="1091240492">
-    <w:abstractNumId w:val="39"/>
-  </w:num>
-  <w:num w:numId="43" w16cid:durableId="970869620">
-    <w:abstractNumId w:val="25"/>
-  </w:num>
-  <w:num w:numId="44" w16cid:durableId="333996985">
-    <w:abstractNumId w:val="48"/>
-  </w:num>
-  <w:num w:numId="45" w16cid:durableId="1749573883">
-    <w:abstractNumId w:val="0"/>
-  </w:num>
-  <w:num w:numId="46" w16cid:durableId="1873029967">
-    <w:abstractNumId w:val="5"/>
-  </w:num>
-  <w:num w:numId="47" w16cid:durableId="912086002">
-    <w:abstractNumId w:val="13"/>
-  </w:num>
-  <w:num w:numId="48" w16cid:durableId="358042909">
-    <w:abstractNumId w:val="44"/>
-  </w:num>
-  <w:num w:numId="49" w16cid:durableId="555553673">
-    <w:abstractNumId w:val="26"/>
-  </w:num>
-  <w:num w:numId="50" w16cid:durableId="1278945193">
-    <w:abstractNumId w:val="10"/>
-  </w:num>
-  <w:numIdMacAtCleanup w:val="33"/>
+  <w:numIdMacAtCleanup w:val="52"/>
 </w:numbering>
 </file>
 

</xml_diff>